<commit_message>
update docs for automatic processing
</commit_message>
<xml_diff>
--- a/Docs/Documentation.docx
+++ b/Docs/Documentation.docx
@@ -247,7 +247,26 @@
               <w:szCs w:val="28"/>
               <w:lang w:eastAsia="ko-KR"/>
             </w:rPr>
-            <w:t xml:space="preserve">50251*66 </w:t>
+            <w:t>50251</w:t>
+          </w:r>
+          <w:r>
+            <w:rPr>
+              <w:b/>
+              <w:bCs/>
+              <w:szCs w:val="28"/>
+              <w:lang w:eastAsia="ko-KR"/>
+            </w:rPr>
+            <w:t>5</w:t>
+          </w:r>
+          <w:r>
+            <w:rPr>
+              <w:rFonts w:hint="eastAsia"/>
+              <w:b/>
+              <w:bCs/>
+              <w:szCs w:val="28"/>
+              <w:lang w:eastAsia="ko-KR"/>
+            </w:rPr>
+            <w:t xml:space="preserve">66 </w:t>
           </w:r>
           <w:r>
             <w:rPr>
@@ -269,7 +288,6 @@
             </w:rPr>
             <w:t xml:space="preserve"> </w:t>
           </w:r>
-          <w:proofErr w:type="spellStart"/>
           <w:r>
             <w:rPr>
               <w:rFonts w:hint="eastAsia"/>
@@ -280,7 +298,6 @@
             </w:rPr>
             <w:t>고레츠키</w:t>
           </w:r>
-          <w:proofErr w:type="spellEnd"/>
         </w:p>
         <w:p>
           <w:pPr>
@@ -432,7 +449,7 @@
       <w:sdtContent>
         <w:p>
           <w:pPr>
-            <w:pStyle w:val="TOC"/>
+            <w:pStyle w:val="TOCHeading"/>
           </w:pPr>
           <w:r>
             <w:t>Contents</w:t>
@@ -440,14 +457,13 @@
         </w:p>
         <w:p>
           <w:pPr>
-            <w:pStyle w:val="10"/>
+            <w:pStyle w:val="TOC1"/>
             <w:tabs>
               <w:tab w:val="right" w:leader="dot" w:pos="9016"/>
             </w:tabs>
             <w:rPr>
               <w:noProof/>
-              <w:sz w:val="22"/>
-              <w:lang w:eastAsia="ko-KR"/>
+              <w:lang w:val="en-DE" w:eastAsia="en-DE"/>
             </w:rPr>
           </w:pPr>
           <w:r>
@@ -459,10 +475,10 @@
           <w:r>
             <w:fldChar w:fldCharType="separate"/>
           </w:r>
-          <w:hyperlink w:anchor="_Toc209965430" w:history="1">
-            <w:r>
-              <w:rPr>
-                <w:rStyle w:val="ab"/>
+          <w:hyperlink w:anchor="_Toc211251751" w:history="1">
+            <w:r>
+              <w:rPr>
+                <w:rStyle w:val="Hyperlink"/>
                 <w:noProof/>
               </w:rPr>
               <w:t>Outline of Program</w:t>
@@ -486,7 +502,7 @@
                 <w:noProof/>
                 <w:webHidden/>
               </w:rPr>
-              <w:instrText xml:space="preserve"> PAGEREF _Toc209965430 \h </w:instrText>
+              <w:instrText xml:space="preserve"> PAGEREF _Toc211251751 \h </w:instrText>
             </w:r>
             <w:r>
               <w:rPr>
@@ -519,20 +535,19 @@
         </w:p>
         <w:p>
           <w:pPr>
-            <w:pStyle w:val="20"/>
+            <w:pStyle w:val="TOC2"/>
             <w:tabs>
               <w:tab w:val="right" w:leader="dot" w:pos="9016"/>
             </w:tabs>
             <w:rPr>
               <w:noProof/>
-              <w:sz w:val="22"/>
-              <w:lang w:eastAsia="ko-KR"/>
+              <w:lang w:val="en-DE" w:eastAsia="en-DE"/>
             </w:rPr>
           </w:pPr>
-          <w:hyperlink w:anchor="_Toc209965431" w:history="1">
-            <w:r>
-              <w:rPr>
-                <w:rStyle w:val="ab"/>
+          <w:hyperlink w:anchor="_Toc211251752" w:history="1">
+            <w:r>
+              <w:rPr>
+                <w:rStyle w:val="Hyperlink"/>
                 <w:noProof/>
               </w:rPr>
               <w:t>Purpose</w:t>
@@ -556,7 +571,7 @@
                 <w:noProof/>
                 <w:webHidden/>
               </w:rPr>
-              <w:instrText xml:space="preserve"> PAGEREF _Toc209965431 \h </w:instrText>
+              <w:instrText xml:space="preserve"> PAGEREF _Toc211251752 \h </w:instrText>
             </w:r>
             <w:r>
               <w:rPr>
@@ -589,20 +604,19 @@
         </w:p>
         <w:p>
           <w:pPr>
-            <w:pStyle w:val="20"/>
+            <w:pStyle w:val="TOC2"/>
             <w:tabs>
               <w:tab w:val="right" w:leader="dot" w:pos="9016"/>
             </w:tabs>
             <w:rPr>
               <w:noProof/>
-              <w:sz w:val="22"/>
-              <w:lang w:eastAsia="ko-KR"/>
+              <w:lang w:val="en-DE" w:eastAsia="en-DE"/>
             </w:rPr>
           </w:pPr>
-          <w:hyperlink w:anchor="_Toc209965432" w:history="1">
-            <w:r>
-              <w:rPr>
-                <w:rStyle w:val="ab"/>
+          <w:hyperlink w:anchor="_Toc211251753" w:history="1">
+            <w:r>
+              <w:rPr>
+                <w:rStyle w:val="Hyperlink"/>
                 <w:noProof/>
               </w:rPr>
               <w:t>Functionality Overview</w:t>
@@ -626,7 +640,7 @@
                 <w:noProof/>
                 <w:webHidden/>
               </w:rPr>
-              <w:instrText xml:space="preserve"> PAGEREF _Toc209965432 \h </w:instrText>
+              <w:instrText xml:space="preserve"> PAGEREF _Toc211251753 \h </w:instrText>
             </w:r>
             <w:r>
               <w:rPr>
@@ -659,20 +673,19 @@
         </w:p>
         <w:p>
           <w:pPr>
-            <w:pStyle w:val="10"/>
+            <w:pStyle w:val="TOC1"/>
             <w:tabs>
               <w:tab w:val="right" w:leader="dot" w:pos="9016"/>
             </w:tabs>
             <w:rPr>
               <w:noProof/>
-              <w:sz w:val="22"/>
-              <w:lang w:eastAsia="ko-KR"/>
+              <w:lang w:val="en-DE" w:eastAsia="en-DE"/>
             </w:rPr>
           </w:pPr>
-          <w:hyperlink w:anchor="_Toc209965433" w:history="1">
-            <w:r>
-              <w:rPr>
-                <w:rStyle w:val="ab"/>
+          <w:hyperlink w:anchor="_Toc211251754" w:history="1">
+            <w:r>
+              <w:rPr>
+                <w:rStyle w:val="Hyperlink"/>
                 <w:noProof/>
               </w:rPr>
               <w:t>Design of Program</w:t>
@@ -696,7 +709,7 @@
                 <w:noProof/>
                 <w:webHidden/>
               </w:rPr>
-              <w:instrText xml:space="preserve"> PAGEREF _Toc209965433 \h </w:instrText>
+              <w:instrText xml:space="preserve"> PAGEREF _Toc211251754 \h </w:instrText>
             </w:r>
             <w:r>
               <w:rPr>
@@ -729,20 +742,19 @@
         </w:p>
         <w:p>
           <w:pPr>
-            <w:pStyle w:val="20"/>
+            <w:pStyle w:val="TOC2"/>
             <w:tabs>
               <w:tab w:val="right" w:leader="dot" w:pos="9016"/>
             </w:tabs>
             <w:rPr>
               <w:noProof/>
-              <w:sz w:val="22"/>
-              <w:lang w:eastAsia="ko-KR"/>
+              <w:lang w:val="en-DE" w:eastAsia="en-DE"/>
             </w:rPr>
           </w:pPr>
-          <w:hyperlink w:anchor="_Toc209965434" w:history="1">
-            <w:r>
-              <w:rPr>
-                <w:rStyle w:val="ab"/>
+          <w:hyperlink w:anchor="_Toc211251755" w:history="1">
+            <w:r>
+              <w:rPr>
+                <w:rStyle w:val="Hyperlink"/>
                 <w:noProof/>
               </w:rPr>
               <w:t>High-Level Design</w:t>
@@ -766,7 +778,7 @@
                 <w:noProof/>
                 <w:webHidden/>
               </w:rPr>
-              <w:instrText xml:space="preserve"> PAGEREF _Toc209965434 \h </w:instrText>
+              <w:instrText xml:space="preserve"> PAGEREF _Toc211251755 \h </w:instrText>
             </w:r>
             <w:r>
               <w:rPr>
@@ -799,20 +811,19 @@
         </w:p>
         <w:p>
           <w:pPr>
-            <w:pStyle w:val="20"/>
+            <w:pStyle w:val="TOC2"/>
             <w:tabs>
               <w:tab w:val="right" w:leader="dot" w:pos="9016"/>
             </w:tabs>
             <w:rPr>
               <w:noProof/>
-              <w:sz w:val="22"/>
-              <w:lang w:eastAsia="ko-KR"/>
+              <w:lang w:val="en-DE" w:eastAsia="en-DE"/>
             </w:rPr>
           </w:pPr>
-          <w:hyperlink w:anchor="_Toc209965435" w:history="1">
-            <w:r>
-              <w:rPr>
-                <w:rStyle w:val="ab"/>
+          <w:hyperlink w:anchor="_Toc211251756" w:history="1">
+            <w:r>
+              <w:rPr>
+                <w:rStyle w:val="Hyperlink"/>
                 <w:noProof/>
               </w:rPr>
               <w:t>Flow Diagram</w:t>
@@ -836,7 +847,7 @@
                 <w:noProof/>
                 <w:webHidden/>
               </w:rPr>
-              <w:instrText xml:space="preserve"> PAGEREF _Toc209965435 \h </w:instrText>
+              <w:instrText xml:space="preserve"> PAGEREF _Toc211251756 \h </w:instrText>
             </w:r>
             <w:r>
               <w:rPr>
@@ -869,20 +880,19 @@
         </w:p>
         <w:p>
           <w:pPr>
-            <w:pStyle w:val="20"/>
+            <w:pStyle w:val="TOC2"/>
             <w:tabs>
               <w:tab w:val="right" w:leader="dot" w:pos="9016"/>
             </w:tabs>
             <w:rPr>
               <w:noProof/>
-              <w:sz w:val="22"/>
-              <w:lang w:eastAsia="ko-KR"/>
+              <w:lang w:val="en-DE" w:eastAsia="en-DE"/>
             </w:rPr>
           </w:pPr>
-          <w:hyperlink w:anchor="_Toc209965436" w:history="1">
-            <w:r>
-              <w:rPr>
-                <w:rStyle w:val="ab"/>
+          <w:hyperlink w:anchor="_Toc211251757" w:history="1">
+            <w:r>
+              <w:rPr>
+                <w:rStyle w:val="Hyperlink"/>
                 <w:noProof/>
               </w:rPr>
               <w:t>Implementation Notes</w:t>
@@ -906,7 +916,7 @@
                 <w:noProof/>
                 <w:webHidden/>
               </w:rPr>
-              <w:instrText xml:space="preserve"> PAGEREF _Toc209965436 \h </w:instrText>
+              <w:instrText xml:space="preserve"> PAGEREF _Toc211251757 \h </w:instrText>
             </w:r>
             <w:r>
               <w:rPr>
@@ -939,20 +949,19 @@
         </w:p>
         <w:p>
           <w:pPr>
-            <w:pStyle w:val="20"/>
+            <w:pStyle w:val="TOC2"/>
             <w:tabs>
               <w:tab w:val="right" w:leader="dot" w:pos="9016"/>
             </w:tabs>
             <w:rPr>
               <w:noProof/>
-              <w:sz w:val="22"/>
-              <w:lang w:eastAsia="ko-KR"/>
+              <w:lang w:val="en-DE" w:eastAsia="en-DE"/>
             </w:rPr>
           </w:pPr>
-          <w:hyperlink w:anchor="_Toc209965437" w:history="1">
-            <w:r>
-              <w:rPr>
-                <w:rStyle w:val="ab"/>
+          <w:hyperlink w:anchor="_Toc211251758" w:history="1">
+            <w:r>
+              <w:rPr>
+                <w:rStyle w:val="Hyperlink"/>
                 <w:noProof/>
                 <w:lang w:eastAsia="ko-KR"/>
               </w:rPr>
@@ -977,7 +986,7 @@
                 <w:noProof/>
                 <w:webHidden/>
               </w:rPr>
-              <w:instrText xml:space="preserve"> PAGEREF _Toc209965437 \h </w:instrText>
+              <w:instrText xml:space="preserve"> PAGEREF _Toc211251758 \h </w:instrText>
             </w:r>
             <w:r>
               <w:rPr>
@@ -1010,20 +1019,19 @@
         </w:p>
         <w:p>
           <w:pPr>
-            <w:pStyle w:val="10"/>
+            <w:pStyle w:val="TOC1"/>
             <w:tabs>
               <w:tab w:val="right" w:leader="dot" w:pos="9016"/>
             </w:tabs>
             <w:rPr>
               <w:noProof/>
-              <w:sz w:val="22"/>
-              <w:lang w:eastAsia="ko-KR"/>
+              <w:lang w:val="en-DE" w:eastAsia="en-DE"/>
             </w:rPr>
           </w:pPr>
-          <w:hyperlink w:anchor="_Toc209965438" w:history="1">
-            <w:r>
-              <w:rPr>
-                <w:rStyle w:val="ab"/>
+          <w:hyperlink w:anchor="_Toc211251759" w:history="1">
+            <w:r>
+              <w:rPr>
+                <w:rStyle w:val="Hyperlink"/>
                 <w:noProof/>
               </w:rPr>
               <w:t>Time spent</w:t>
@@ -1047,7 +1055,7 @@
                 <w:noProof/>
                 <w:webHidden/>
               </w:rPr>
-              <w:instrText xml:space="preserve"> PAGEREF _Toc209965438 \h </w:instrText>
+              <w:instrText xml:space="preserve"> PAGEREF _Toc211251759 \h </w:instrText>
             </w:r>
             <w:r>
               <w:rPr>
@@ -1080,20 +1088,19 @@
         </w:p>
         <w:p>
           <w:pPr>
-            <w:pStyle w:val="10"/>
+            <w:pStyle w:val="TOC1"/>
             <w:tabs>
               <w:tab w:val="right" w:leader="dot" w:pos="9016"/>
             </w:tabs>
             <w:rPr>
               <w:noProof/>
-              <w:sz w:val="22"/>
-              <w:lang w:eastAsia="ko-KR"/>
+              <w:lang w:val="en-DE" w:eastAsia="en-DE"/>
             </w:rPr>
           </w:pPr>
-          <w:hyperlink w:anchor="_Toc209965439" w:history="1">
-            <w:r>
-              <w:rPr>
-                <w:rStyle w:val="ab"/>
+          <w:hyperlink w:anchor="_Toc211251760" w:history="1">
+            <w:r>
+              <w:rPr>
+                <w:rStyle w:val="Hyperlink"/>
                 <w:noProof/>
               </w:rPr>
               <w:t>Process of Project and Record of Project Meetings</w:t>
@@ -1117,7 +1124,7 @@
                 <w:noProof/>
                 <w:webHidden/>
               </w:rPr>
-              <w:instrText xml:space="preserve"> PAGEREF _Toc209965439 \h </w:instrText>
+              <w:instrText xml:space="preserve"> PAGEREF _Toc211251760 \h </w:instrText>
             </w:r>
             <w:r>
               <w:rPr>
@@ -1137,7 +1144,7 @@
                 <w:noProof/>
                 <w:webHidden/>
               </w:rPr>
-              <w:t>4</w:t>
+              <w:t>5</w:t>
             </w:r>
             <w:r>
               <w:rPr>
@@ -1150,20 +1157,19 @@
         </w:p>
         <w:p>
           <w:pPr>
-            <w:pStyle w:val="20"/>
+            <w:pStyle w:val="TOC2"/>
             <w:tabs>
               <w:tab w:val="right" w:leader="dot" w:pos="9016"/>
             </w:tabs>
             <w:rPr>
               <w:noProof/>
-              <w:sz w:val="22"/>
-              <w:lang w:eastAsia="ko-KR"/>
+              <w:lang w:val="en-DE" w:eastAsia="en-DE"/>
             </w:rPr>
           </w:pPr>
-          <w:hyperlink w:anchor="_Toc209965440" w:history="1">
-            <w:r>
-              <w:rPr>
-                <w:rStyle w:val="ab"/>
+          <w:hyperlink w:anchor="_Toc211251761" w:history="1">
+            <w:r>
+              <w:rPr>
+                <w:rStyle w:val="Hyperlink"/>
                 <w:noProof/>
               </w:rPr>
               <w:t>Meeting 1 – Project Kickoff</w:t>
@@ -1187,7 +1193,7 @@
                 <w:noProof/>
                 <w:webHidden/>
               </w:rPr>
-              <w:instrText xml:space="preserve"> PAGEREF _Toc209965440 \h </w:instrText>
+              <w:instrText xml:space="preserve"> PAGEREF _Toc211251761 \h </w:instrText>
             </w:r>
             <w:r>
               <w:rPr>
@@ -1207,7 +1213,7 @@
                 <w:noProof/>
                 <w:webHidden/>
               </w:rPr>
-              <w:t>4</w:t>
+              <w:t>5</w:t>
             </w:r>
             <w:r>
               <w:rPr>
@@ -1220,20 +1226,19 @@
         </w:p>
         <w:p>
           <w:pPr>
-            <w:pStyle w:val="20"/>
+            <w:pStyle w:val="TOC2"/>
             <w:tabs>
               <w:tab w:val="right" w:leader="dot" w:pos="9016"/>
             </w:tabs>
             <w:rPr>
               <w:noProof/>
-              <w:sz w:val="22"/>
-              <w:lang w:eastAsia="ko-KR"/>
+              <w:lang w:val="en-DE" w:eastAsia="en-DE"/>
             </w:rPr>
           </w:pPr>
-          <w:hyperlink w:anchor="_Toc209965441" w:history="1">
-            <w:r>
-              <w:rPr>
-                <w:rStyle w:val="ab"/>
+          <w:hyperlink w:anchor="_Toc211251762" w:history="1">
+            <w:r>
+              <w:rPr>
+                <w:rStyle w:val="Hyperlink"/>
                 <w:noProof/>
               </w:rPr>
               <w:t>Meeting 2 – Review &amp; Integration</w:t>
@@ -1257,7 +1262,7 @@
                 <w:noProof/>
                 <w:webHidden/>
               </w:rPr>
-              <w:instrText xml:space="preserve"> PAGEREF _Toc209965441 \h </w:instrText>
+              <w:instrText xml:space="preserve"> PAGEREF _Toc211251762 \h </w:instrText>
             </w:r>
             <w:r>
               <w:rPr>
@@ -1277,7 +1282,7 @@
                 <w:noProof/>
                 <w:webHidden/>
               </w:rPr>
-              <w:t>4</w:t>
+              <w:t>5</w:t>
             </w:r>
             <w:r>
               <w:rPr>
@@ -1290,20 +1295,19 @@
         </w:p>
         <w:p>
           <w:pPr>
-            <w:pStyle w:val="20"/>
+            <w:pStyle w:val="TOC2"/>
             <w:tabs>
               <w:tab w:val="right" w:leader="dot" w:pos="9016"/>
             </w:tabs>
             <w:rPr>
               <w:noProof/>
-              <w:sz w:val="22"/>
-              <w:lang w:eastAsia="ko-KR"/>
+              <w:lang w:val="en-DE" w:eastAsia="en-DE"/>
             </w:rPr>
           </w:pPr>
-          <w:hyperlink w:anchor="_Toc209965442" w:history="1">
-            <w:r>
-              <w:rPr>
-                <w:rStyle w:val="ab"/>
+          <w:hyperlink w:anchor="_Toc211251763" w:history="1">
+            <w:r>
+              <w:rPr>
+                <w:rStyle w:val="Hyperlink"/>
                 <w:noProof/>
               </w:rPr>
               <w:t>Records</w:t>
@@ -1327,7 +1331,7 @@
                 <w:noProof/>
                 <w:webHidden/>
               </w:rPr>
-              <w:instrText xml:space="preserve"> PAGEREF _Toc209965442 \h </w:instrText>
+              <w:instrText xml:space="preserve"> PAGEREF _Toc211251763 \h </w:instrText>
             </w:r>
             <w:r>
               <w:rPr>
@@ -1347,7 +1351,7 @@
                 <w:noProof/>
                 <w:webHidden/>
               </w:rPr>
-              <w:t>4</w:t>
+              <w:t>5</w:t>
             </w:r>
             <w:r>
               <w:rPr>
@@ -1360,20 +1364,19 @@
         </w:p>
         <w:p>
           <w:pPr>
-            <w:pStyle w:val="20"/>
+            <w:pStyle w:val="TOC2"/>
             <w:tabs>
               <w:tab w:val="right" w:leader="dot" w:pos="9016"/>
             </w:tabs>
             <w:rPr>
               <w:noProof/>
-              <w:sz w:val="22"/>
-              <w:lang w:eastAsia="ko-KR"/>
+              <w:lang w:val="en-DE" w:eastAsia="en-DE"/>
             </w:rPr>
           </w:pPr>
-          <w:hyperlink w:anchor="_Toc209965443" w:history="1">
-            <w:r>
-              <w:rPr>
-                <w:rStyle w:val="ab"/>
+          <w:hyperlink w:anchor="_Toc211251764" w:history="1">
+            <w:r>
+              <w:rPr>
+                <w:rStyle w:val="Hyperlink"/>
                 <w:noProof/>
                 <w:lang w:eastAsia="ko-KR"/>
               </w:rPr>
@@ -1398,7 +1401,7 @@
                 <w:noProof/>
                 <w:webHidden/>
               </w:rPr>
-              <w:instrText xml:space="preserve"> PAGEREF _Toc209965443 \h </w:instrText>
+              <w:instrText xml:space="preserve"> PAGEREF _Toc211251764 \h </w:instrText>
             </w:r>
             <w:r>
               <w:rPr>
@@ -1431,20 +1434,19 @@
         </w:p>
         <w:p>
           <w:pPr>
-            <w:pStyle w:val="10"/>
+            <w:pStyle w:val="TOC1"/>
             <w:tabs>
               <w:tab w:val="right" w:leader="dot" w:pos="9016"/>
             </w:tabs>
             <w:rPr>
               <w:noProof/>
-              <w:sz w:val="22"/>
-              <w:lang w:eastAsia="ko-KR"/>
+              <w:lang w:val="en-DE" w:eastAsia="en-DE"/>
             </w:rPr>
           </w:pPr>
-          <w:hyperlink w:anchor="_Toc209965444" w:history="1">
-            <w:r>
-              <w:rPr>
-                <w:rStyle w:val="ab"/>
+          <w:hyperlink w:anchor="_Toc211251765" w:history="1">
+            <w:r>
+              <w:rPr>
+                <w:rStyle w:val="Hyperlink"/>
                 <w:noProof/>
               </w:rPr>
               <w:t>Member's Thoughts on This Project</w:t>
@@ -1468,7 +1470,7 @@
                 <w:noProof/>
                 <w:webHidden/>
               </w:rPr>
-              <w:instrText xml:space="preserve"> PAGEREF _Toc209965444 \h </w:instrText>
+              <w:instrText xml:space="preserve"> PAGEREF _Toc211251765 \h </w:instrText>
             </w:r>
             <w:r>
               <w:rPr>
@@ -1501,20 +1503,19 @@
         </w:p>
         <w:p>
           <w:pPr>
-            <w:pStyle w:val="20"/>
+            <w:pStyle w:val="TOC2"/>
             <w:tabs>
               <w:tab w:val="right" w:leader="dot" w:pos="9016"/>
             </w:tabs>
             <w:rPr>
               <w:noProof/>
-              <w:sz w:val="22"/>
-              <w:lang w:eastAsia="ko-KR"/>
+              <w:lang w:val="en-DE" w:eastAsia="en-DE"/>
             </w:rPr>
           </w:pPr>
-          <w:hyperlink w:anchor="_Toc209965445" w:history="1">
-            <w:r>
-              <w:rPr>
-                <w:rStyle w:val="ab"/>
+          <w:hyperlink w:anchor="_Toc211251766" w:history="1">
+            <w:r>
+              <w:rPr>
+                <w:rStyle w:val="Hyperlink"/>
                 <w:noProof/>
               </w:rPr>
               <w:t>Lessons Learned</w:t>
@@ -1538,7 +1539,7 @@
                 <w:noProof/>
                 <w:webHidden/>
               </w:rPr>
-              <w:instrText xml:space="preserve"> PAGEREF _Toc209965445 \h </w:instrText>
+              <w:instrText xml:space="preserve"> PAGEREF _Toc211251766 \h </w:instrText>
             </w:r>
             <w:r>
               <w:rPr>
@@ -1571,20 +1572,19 @@
         </w:p>
         <w:p>
           <w:pPr>
-            <w:pStyle w:val="20"/>
+            <w:pStyle w:val="TOC2"/>
             <w:tabs>
               <w:tab w:val="right" w:leader="dot" w:pos="9016"/>
             </w:tabs>
             <w:rPr>
               <w:noProof/>
-              <w:sz w:val="22"/>
-              <w:lang w:eastAsia="ko-KR"/>
+              <w:lang w:val="en-DE" w:eastAsia="en-DE"/>
             </w:rPr>
           </w:pPr>
-          <w:hyperlink w:anchor="_Toc209965446" w:history="1">
-            <w:r>
-              <w:rPr>
-                <w:rStyle w:val="ab"/>
+          <w:hyperlink w:anchor="_Toc211251767" w:history="1">
+            <w:r>
+              <w:rPr>
+                <w:rStyle w:val="Hyperlink"/>
                 <w:noProof/>
               </w:rPr>
               <w:t>Future Improvements</w:t>
@@ -1608,7 +1608,7 @@
                 <w:noProof/>
                 <w:webHidden/>
               </w:rPr>
-              <w:instrText xml:space="preserve"> PAGEREF _Toc209965446 \h </w:instrText>
+              <w:instrText xml:space="preserve"> PAGEREF _Toc211251767 \h </w:instrText>
             </w:r>
             <w:r>
               <w:rPr>
@@ -1718,18 +1718,17 @@
     <w:p>
       <w:pPr>
         <w:rPr>
-          <w:rFonts w:hint="eastAsia"/>
-          <w:lang w:eastAsia="ko-KR"/>
-        </w:rPr>
-      </w:pPr>
-    </w:p>
-    <w:p>
-      <w:pPr>
-        <w:pStyle w:val="1"/>
+          <w:lang w:eastAsia="ko-KR"/>
+        </w:rPr>
+      </w:pPr>
+    </w:p>
+    <w:p>
+      <w:pPr>
+        <w:pStyle w:val="Heading1"/>
         <w:jc w:val="both"/>
       </w:pPr>
       <w:bookmarkStart w:id="0" w:name="_Hlk198644379"/>
-      <w:bookmarkStart w:id="1" w:name="_Toc209965430"/>
+      <w:bookmarkStart w:id="1" w:name="_Toc211251751"/>
       <w:bookmarkEnd w:id="0"/>
       <w:r>
         <w:lastRenderedPageBreak/>
@@ -1739,10 +1738,10 @@
     </w:p>
     <w:p>
       <w:pPr>
-        <w:pStyle w:val="2"/>
-        <w:jc w:val="both"/>
-      </w:pPr>
-      <w:bookmarkStart w:id="2" w:name="_Toc209965431"/>
+        <w:pStyle w:val="Heading2"/>
+        <w:jc w:val="both"/>
+      </w:pPr>
+      <w:bookmarkStart w:id="2" w:name="_Toc211251752"/>
       <w:r>
         <w:t>Purpose</w:t>
       </w:r>
@@ -1758,10 +1757,10 @@
     </w:p>
     <w:p>
       <w:pPr>
-        <w:pStyle w:val="2"/>
-        <w:jc w:val="both"/>
-      </w:pPr>
-      <w:bookmarkStart w:id="3" w:name="_Toc209965432"/>
+        <w:pStyle w:val="Heading2"/>
+        <w:jc w:val="both"/>
+      </w:pPr>
+      <w:bookmarkStart w:id="3" w:name="_Toc211251753"/>
       <w:r>
         <w:t>Functionality Overview</w:t>
       </w:r>
@@ -1769,7 +1768,7 @@
     </w:p>
     <w:p>
       <w:pPr>
-        <w:pStyle w:val="a6"/>
+        <w:pStyle w:val="ListParagraph"/>
         <w:numPr>
           <w:ilvl w:val="0"/>
           <w:numId w:val="1"/>
@@ -1790,7 +1789,7 @@
     </w:p>
     <w:p>
       <w:pPr>
-        <w:pStyle w:val="a6"/>
+        <w:pStyle w:val="ListParagraph"/>
         <w:numPr>
           <w:ilvl w:val="0"/>
           <w:numId w:val="1"/>
@@ -1803,7 +1802,7 @@
     </w:p>
     <w:p>
       <w:pPr>
-        <w:pStyle w:val="a6"/>
+        <w:pStyle w:val="ListParagraph"/>
         <w:numPr>
           <w:ilvl w:val="1"/>
           <w:numId w:val="1"/>
@@ -1816,7 +1815,7 @@
     </w:p>
     <w:p>
       <w:pPr>
-        <w:pStyle w:val="a6"/>
+        <w:pStyle w:val="ListParagraph"/>
         <w:numPr>
           <w:ilvl w:val="1"/>
           <w:numId w:val="1"/>
@@ -1829,7 +1828,7 @@
     </w:p>
     <w:p>
       <w:pPr>
-        <w:pStyle w:val="a6"/>
+        <w:pStyle w:val="ListParagraph"/>
         <w:numPr>
           <w:ilvl w:val="0"/>
           <w:numId w:val="1"/>
@@ -1842,7 +1841,7 @@
     </w:p>
     <w:p>
       <w:pPr>
-        <w:pStyle w:val="a6"/>
+        <w:pStyle w:val="ListParagraph"/>
         <w:numPr>
           <w:ilvl w:val="0"/>
           <w:numId w:val="1"/>
@@ -1855,10 +1854,10 @@
     </w:p>
     <w:p>
       <w:pPr>
-        <w:pStyle w:val="1"/>
-        <w:jc w:val="both"/>
-      </w:pPr>
-      <w:bookmarkStart w:id="4" w:name="_Toc209965433"/>
+        <w:pStyle w:val="Heading1"/>
+        <w:jc w:val="both"/>
+      </w:pPr>
+      <w:bookmarkStart w:id="4" w:name="_Toc211251754"/>
       <w:r>
         <w:t>Design of Program</w:t>
       </w:r>
@@ -1866,10 +1865,10 @@
     </w:p>
     <w:p>
       <w:pPr>
-        <w:pStyle w:val="2"/>
-        <w:jc w:val="both"/>
-      </w:pPr>
-      <w:bookmarkStart w:id="5" w:name="_Toc209965434"/>
+        <w:pStyle w:val="Heading2"/>
+        <w:jc w:val="both"/>
+      </w:pPr>
+      <w:bookmarkStart w:id="5" w:name="_Toc211251755"/>
       <w:r>
         <w:t>High-Level Design</w:t>
       </w:r>
@@ -1877,7 +1876,7 @@
     </w:p>
     <w:p>
       <w:pPr>
-        <w:pStyle w:val="a6"/>
+        <w:pStyle w:val="ListParagraph"/>
         <w:numPr>
           <w:ilvl w:val="0"/>
           <w:numId w:val="2"/>
@@ -1896,7 +1895,7 @@
     </w:p>
     <w:p>
       <w:pPr>
-        <w:pStyle w:val="a6"/>
+        <w:pStyle w:val="ListParagraph"/>
         <w:numPr>
           <w:ilvl w:val="0"/>
           <w:numId w:val="2"/>
@@ -1915,7 +1914,7 @@
     </w:p>
     <w:p>
       <w:pPr>
-        <w:pStyle w:val="a6"/>
+        <w:pStyle w:val="ListParagraph"/>
         <w:numPr>
           <w:ilvl w:val="0"/>
           <w:numId w:val="3"/>
@@ -1928,7 +1927,7 @@
     </w:p>
     <w:p>
       <w:pPr>
-        <w:pStyle w:val="a6"/>
+        <w:pStyle w:val="ListParagraph"/>
         <w:numPr>
           <w:ilvl w:val="0"/>
           <w:numId w:val="3"/>
@@ -1941,7 +1940,7 @@
     </w:p>
     <w:p>
       <w:pPr>
-        <w:pStyle w:val="a6"/>
+        <w:pStyle w:val="ListParagraph"/>
         <w:numPr>
           <w:ilvl w:val="0"/>
           <w:numId w:val="3"/>
@@ -1954,7 +1953,7 @@
     </w:p>
     <w:p>
       <w:pPr>
-        <w:pStyle w:val="a6"/>
+        <w:pStyle w:val="ListParagraph"/>
         <w:numPr>
           <w:ilvl w:val="0"/>
           <w:numId w:val="2"/>
@@ -1973,10 +1972,10 @@
     </w:p>
     <w:p>
       <w:pPr>
-        <w:pStyle w:val="2"/>
-        <w:jc w:val="both"/>
-      </w:pPr>
-      <w:bookmarkStart w:id="6" w:name="_Toc209965435"/>
+        <w:pStyle w:val="Heading2"/>
+        <w:jc w:val="both"/>
+      </w:pPr>
+      <w:bookmarkStart w:id="6" w:name="_Toc211251756"/>
       <w:r>
         <w:t>Flow Diagram</w:t>
       </w:r>
@@ -2047,10 +2046,10 @@
     </w:p>
     <w:p>
       <w:pPr>
-        <w:pStyle w:val="2"/>
-        <w:jc w:val="both"/>
-      </w:pPr>
-      <w:bookmarkStart w:id="7" w:name="_Toc209965436"/>
+        <w:pStyle w:val="Heading2"/>
+        <w:jc w:val="both"/>
+      </w:pPr>
+      <w:bookmarkStart w:id="7" w:name="_Toc211251757"/>
       <w:r>
         <w:lastRenderedPageBreak/>
         <w:t>Implementation Notes</w:t>
@@ -2059,7 +2058,7 @@
     </w:p>
     <w:p>
       <w:pPr>
-        <w:pStyle w:val="a6"/>
+        <w:pStyle w:val="ListParagraph"/>
         <w:numPr>
           <w:ilvl w:val="0"/>
           <w:numId w:val="2"/>
@@ -2072,7 +2071,7 @@
     </w:p>
     <w:p>
       <w:pPr>
-        <w:pStyle w:val="a6"/>
+        <w:pStyle w:val="ListParagraph"/>
         <w:numPr>
           <w:ilvl w:val="0"/>
           <w:numId w:val="2"/>
@@ -2085,13 +2084,13 @@
     </w:p>
     <w:p>
       <w:pPr>
-        <w:pStyle w:val="2"/>
-        <w:jc w:val="both"/>
-        <w:rPr>
-          <w:lang w:eastAsia="ko-KR"/>
-        </w:rPr>
-      </w:pPr>
-      <w:bookmarkStart w:id="8" w:name="_Toc209965437"/>
+        <w:pStyle w:val="Heading2"/>
+        <w:jc w:val="both"/>
+        <w:rPr>
+          <w:lang w:eastAsia="ko-KR"/>
+        </w:rPr>
+      </w:pPr>
+      <w:bookmarkStart w:id="8" w:name="_Toc211251758"/>
       <w:r>
         <w:rPr>
           <w:rFonts w:hint="eastAsia"/>
@@ -2116,7 +2115,7 @@
     </w:p>
     <w:p>
       <w:pPr>
-        <w:pStyle w:val="a6"/>
+        <w:pStyle w:val="ListParagraph"/>
         <w:numPr>
           <w:ilvl w:val="0"/>
           <w:numId w:val="2"/>
@@ -2141,7 +2140,20 @@
           <w:rFonts w:hint="eastAsia"/>
           <w:lang w:eastAsia="ko-KR"/>
         </w:rPr>
-        <w:t>ImageProcessingDoc.cpp</w:t>
+        <w:t>ImageProcessin</w:t>
+      </w:r>
+      <w:r>
+        <w:rPr>
+          <w:lang w:eastAsia="ko-KR"/>
+        </w:rPr>
+        <w:t>g</w:t>
+      </w:r>
+      <w:r>
+        <w:rPr>
+          <w:rFonts w:hint="eastAsia"/>
+          <w:lang w:eastAsia="ko-KR"/>
+        </w:rPr>
+        <w:t>.cpp</w:t>
       </w:r>
       <w:r>
         <w:rPr>
@@ -2152,7 +2164,7 @@
     </w:p>
     <w:p>
       <w:pPr>
-        <w:pStyle w:val="a6"/>
+        <w:pStyle w:val="ListParagraph"/>
         <w:numPr>
           <w:ilvl w:val="0"/>
           <w:numId w:val="2"/>
@@ -2160,14 +2172,29 @@
         <w:jc w:val="both"/>
       </w:pPr>
       <w:r>
-        <w:t>After the code is executed, the program runs as shown below</w:t>
-      </w:r>
-      <w:r>
-        <w:rPr>
-          <w:rFonts w:hint="eastAsia"/>
-          <w:lang w:eastAsia="ko-KR"/>
-        </w:rPr>
-        <w:t xml:space="preserve">. Then, click </w:t>
+        <w:t xml:space="preserve">After the code is executed, the program </w:t>
+      </w:r>
+      <w:r>
+        <w:t>runs,</w:t>
+      </w:r>
+      <w:r>
+        <w:t xml:space="preserve"> </w:t>
+      </w:r>
+      <w:r>
+        <w:t>and a window opens</w:t>
+      </w:r>
+    </w:p>
+    <w:p>
+      <w:pPr>
+        <w:pStyle w:val="ListParagraph"/>
+        <w:numPr>
+          <w:ilvl w:val="0"/>
+          <w:numId w:val="2"/>
+        </w:numPr>
+        <w:jc w:val="both"/>
+      </w:pPr>
+      <w:r>
+        <w:t xml:space="preserve">Choose the </w:t>
       </w:r>
       <w:r>
         <w:rPr>
@@ -2176,10 +2203,6 @@
         <w:t>‘</w:t>
       </w:r>
       <w:r>
-        <w:rPr>
-          <w:rFonts w:hint="eastAsia"/>
-          <w:lang w:eastAsia="ko-KR"/>
-        </w:rPr>
         <w:t>File</w:t>
       </w:r>
       <w:r>
@@ -2189,48 +2212,23 @@
         <w:t>’</w:t>
       </w:r>
       <w:r>
-        <w:rPr>
-          <w:rFonts w:hint="eastAsia"/>
-          <w:lang w:eastAsia="ko-KR"/>
-        </w:rPr>
-        <w:t xml:space="preserve"> Tab and open the images(</w:t>
-      </w:r>
-      <w:r>
-        <w:rPr>
-          <w:rFonts w:hint="eastAsia"/>
-          <w:lang w:eastAsia="ko-KR"/>
-        </w:rPr>
-        <w:t>‘</w:t>
-      </w:r>
-      <w:r>
-        <w:rPr>
-          <w:lang w:eastAsia="ko-KR"/>
-        </w:rPr>
-        <w:t>squid_head.png’, ‘squid_body.png, ‘squid_points.png</w:t>
-      </w:r>
-      <w:r>
-        <w:rPr>
-          <w:rFonts w:hint="eastAsia"/>
-          <w:lang w:eastAsia="ko-KR"/>
-        </w:rPr>
-        <w:t>) at the same time</w:t>
-      </w:r>
-    </w:p>
-    <w:p>
-      <w:pPr>
-        <w:pStyle w:val="a6"/>
-        <w:jc w:val="both"/>
+        <w:t xml:space="preserve"> option in the menu bar of the program as shown below</w:t>
+      </w:r>
+    </w:p>
+    <w:p>
+      <w:pPr>
+        <w:ind w:left="360"/>
+        <w:jc w:val="center"/>
       </w:pPr>
       <w:r>
         <w:rPr>
           <w:noProof/>
-          <w:lang w:eastAsia="ko-KR"/>
         </w:rPr>
         <w:drawing>
-          <wp:inline distT="0" distB="0" distL="0" distR="0" wp14:anchorId="65187CC5" wp14:editId="0A19EE43">
-            <wp:extent cx="2617940" cy="2221161"/>
-            <wp:effectExtent l="0" t="0" r="0" b="8255"/>
-            <wp:docPr id="1571883683" name="그림 1" descr="스크린샷, 텍스트이(가) 표시된 사진&#10;&#10;AI 생성 콘텐츠는 정확하지 않을 수 있습니다."/>
+          <wp:inline distT="0" distB="0" distL="0" distR="0" wp14:anchorId="0DC3290F" wp14:editId="578D1158">
+            <wp:extent cx="3569677" cy="2707402"/>
+            <wp:effectExtent l="0" t="0" r="0" b="0"/>
+            <wp:docPr id="1389321525" name="Picture 4"/>
             <wp:cNvGraphicFramePr>
               <a:graphicFrameLocks xmlns:a="http://schemas.openxmlformats.org/drawingml/2006/main" noChangeAspect="1"/>
             </wp:cNvGraphicFramePr>
@@ -2238,23 +2236,36 @@
               <a:graphicData uri="http://schemas.openxmlformats.org/drawingml/2006/picture">
                 <pic:pic xmlns:pic="http://schemas.openxmlformats.org/drawingml/2006/picture">
                   <pic:nvPicPr>
-                    <pic:cNvPr id="1571883683" name="그림 1" descr="스크린샷, 텍스트이(가) 표시된 사진&#10;&#10;AI 생성 콘텐츠는 정확하지 않을 수 있습니다."/>
-                    <pic:cNvPicPr/>
+                    <pic:cNvPr id="0" name="Picture 4"/>
+                    <pic:cNvPicPr>
+                      <a:picLocks noChangeAspect="1" noChangeArrowheads="1"/>
+                    </pic:cNvPicPr>
                   </pic:nvPicPr>
                   <pic:blipFill>
-                    <a:blip r:embed="rId11"/>
+                    <a:blip r:embed="rId11">
+                      <a:extLst>
+                        <a:ext uri="{28A0092B-C50C-407E-A947-70E740481C1C}">
+                          <a14:useLocalDpi xmlns:a14="http://schemas.microsoft.com/office/drawing/2010/main" val="0"/>
+                        </a:ext>
+                      </a:extLst>
+                    </a:blip>
+                    <a:srcRect/>
                     <a:stretch>
                       <a:fillRect/>
                     </a:stretch>
                   </pic:blipFill>
-                  <pic:spPr>
-                    <a:xfrm flipV="1">
+                  <pic:spPr bwMode="auto">
+                    <a:xfrm>
                       <a:off x="0" y="0"/>
-                      <a:ext cx="2672164" cy="2267167"/>
+                      <a:ext cx="3583869" cy="2718166"/>
                     </a:xfrm>
                     <a:prstGeom prst="rect">
                       <a:avLst/>
                     </a:prstGeom>
+                    <a:noFill/>
+                    <a:ln>
+                      <a:noFill/>
+                    </a:ln>
                   </pic:spPr>
                 </pic:pic>
               </a:graphicData>
@@ -2262,20 +2273,246 @@
           </wp:inline>
         </w:drawing>
       </w:r>
+    </w:p>
+    <w:p>
+      <w:pPr>
+        <w:pStyle w:val="ListParagraph"/>
+        <w:numPr>
+          <w:ilvl w:val="0"/>
+          <w:numId w:val="2"/>
+        </w:numPr>
+        <w:jc w:val="both"/>
+      </w:pPr>
+      <w:r>
+        <w:rPr>
+          <w:lang w:eastAsia="ko-KR"/>
+        </w:rPr>
+        <w:t xml:space="preserve">Open all </w:t>
+      </w:r>
+      <w:r>
+        <w:rPr>
+          <w:rFonts w:hint="eastAsia"/>
+          <w:lang w:eastAsia="ko-KR"/>
+        </w:rPr>
+        <w:t xml:space="preserve">the </w:t>
+      </w:r>
+      <w:proofErr w:type="gramStart"/>
+      <w:r>
+        <w:rPr>
+          <w:rFonts w:hint="eastAsia"/>
+          <w:lang w:eastAsia="ko-KR"/>
+        </w:rPr>
+        <w:t>images(</w:t>
+      </w:r>
+      <w:proofErr w:type="gramEnd"/>
+      <w:r>
+        <w:rPr>
+          <w:lang w:eastAsia="ko-KR"/>
+        </w:rPr>
+        <w:t>‘</w:t>
+      </w:r>
+      <w:r>
+        <w:rPr>
+          <w:lang w:eastAsia="ko-KR"/>
+        </w:rPr>
+        <w:t>squid_head.png</w:t>
+      </w:r>
+      <w:proofErr w:type="gramStart"/>
+      <w:r>
+        <w:rPr>
+          <w:lang w:eastAsia="ko-KR"/>
+        </w:rPr>
+        <w:t>’</w:t>
+      </w:r>
+      <w:r>
+        <w:rPr>
+          <w:lang w:eastAsia="ko-KR"/>
+        </w:rPr>
+        <w:t>,</w:t>
+      </w:r>
+      <w:r>
+        <w:rPr>
+          <w:lang w:eastAsia="ko-KR"/>
+        </w:rPr>
+        <w:t xml:space="preserve"> ‘</w:t>
+      </w:r>
+      <w:proofErr w:type="gramEnd"/>
+      <w:r>
+        <w:rPr>
+          <w:lang w:eastAsia="ko-KR"/>
+        </w:rPr>
+        <w:t>squid_body.png</w:t>
+      </w:r>
+      <w:r>
+        <w:rPr>
+          <w:lang w:eastAsia="ko-KR"/>
+        </w:rPr>
+        <w:t>’</w:t>
+      </w:r>
+      <w:r>
+        <w:rPr>
+          <w:lang w:eastAsia="ko-KR"/>
+        </w:rPr>
+        <w:t xml:space="preserve"> and </w:t>
+      </w:r>
+      <w:r>
+        <w:rPr>
+          <w:lang w:eastAsia="ko-KR"/>
+        </w:rPr>
+        <w:t>‘squid_points.png</w:t>
+      </w:r>
+      <w:r>
+        <w:rPr>
+          <w:lang w:eastAsia="ko-KR"/>
+        </w:rPr>
+        <w:t>’</w:t>
+      </w:r>
+      <w:r>
+        <w:rPr>
+          <w:lang w:eastAsia="ko-KR"/>
+        </w:rPr>
+        <w:t xml:space="preserve"> </w:t>
+      </w:r>
+      <w:r>
+        <w:rPr>
+          <w:lang w:eastAsia="ko-KR"/>
+        </w:rPr>
+        <w:t xml:space="preserve">that can </w:t>
+      </w:r>
+      <w:proofErr w:type="gramStart"/>
+      <w:r>
+        <w:rPr>
+          <w:lang w:eastAsia="ko-KR"/>
+        </w:rPr>
+        <w:t>found</w:t>
+      </w:r>
+      <w:proofErr w:type="gramEnd"/>
+      <w:r>
+        <w:rPr>
+          <w:lang w:eastAsia="ko-KR"/>
+        </w:rPr>
+        <w:t xml:space="preserve"> in the same directory as the ImageProcessing.cpp in folder </w:t>
+      </w:r>
+      <w:r>
+        <w:rPr>
+          <w:lang w:eastAsia="ko-KR"/>
+        </w:rPr>
+        <w:t>‘</w:t>
+      </w:r>
+      <w:r>
+        <w:rPr>
+          <w:lang w:eastAsia="ko-KR"/>
+        </w:rPr>
+        <w:t>Term_Project_01_Sample Images</w:t>
+      </w:r>
+      <w:r>
+        <w:rPr>
+          <w:lang w:eastAsia="ko-KR"/>
+        </w:rPr>
+        <w:t>’</w:t>
+      </w:r>
+      <w:r>
+        <w:rPr>
+          <w:rFonts w:hint="eastAsia"/>
+          <w:lang w:eastAsia="ko-KR"/>
+        </w:rPr>
+        <w:t xml:space="preserve">) </w:t>
+      </w:r>
+      <w:r>
+        <w:rPr>
+          <w:lang w:eastAsia="ko-KR"/>
+        </w:rPr>
+        <w:t>one after another</w:t>
+      </w:r>
+    </w:p>
+    <w:p>
+      <w:pPr>
+        <w:pStyle w:val="ListParagraph"/>
+        <w:jc w:val="both"/>
+        <w:rPr>
+          <w:lang w:eastAsia="ko-KR"/>
+        </w:rPr>
+      </w:pPr>
+      <w:r>
+        <w:rPr>
+          <w:lang w:eastAsia="ko-KR"/>
+        </w:rPr>
+        <w:t>(</w:t>
+      </w:r>
+      <w:r>
+        <w:rPr>
+          <w:b/>
+          <w:bCs/>
+          <w:lang w:eastAsia="ko-KR"/>
+        </w:rPr>
+        <w:t>Automatic way</w:t>
+      </w:r>
+      <w:r>
+        <w:rPr>
+          <w:lang w:eastAsia="ko-KR"/>
+        </w:rPr>
+        <w:t xml:space="preserve">: open all the images by choosing </w:t>
+      </w:r>
+      <w:r>
+        <w:rPr>
+          <w:lang w:eastAsia="ko-KR"/>
+        </w:rPr>
+        <w:t>‘</w:t>
+      </w:r>
+      <w:r>
+        <w:rPr>
+          <w:lang w:eastAsia="ko-KR"/>
+        </w:rPr>
+        <w:t>Open Squid Images option</w:t>
+      </w:r>
+      <w:r>
+        <w:rPr>
+          <w:lang w:eastAsia="ko-KR"/>
+        </w:rPr>
+        <w:t>’</w:t>
+      </w:r>
+      <w:r>
+        <w:rPr>
+          <w:lang w:eastAsia="ko-KR"/>
+        </w:rPr>
+        <w:t>)</w:t>
+      </w:r>
+    </w:p>
+    <w:p>
+      <w:pPr>
+        <w:pStyle w:val="ListParagraph"/>
+        <w:numPr>
+          <w:ilvl w:val="0"/>
+          <w:numId w:val="11"/>
+        </w:numPr>
+        <w:jc w:val="both"/>
+      </w:pPr>
+      <w:r>
+        <w:t>A</w:t>
+      </w:r>
+      <w:r>
+        <w:t>ll three pictures</w:t>
+      </w:r>
+      <w:r>
+        <w:t xml:space="preserve"> now</w:t>
+      </w:r>
+      <w:r>
+        <w:t xml:space="preserve"> are opened as shown below</w:t>
+      </w:r>
+    </w:p>
+    <w:p>
+      <w:pPr>
+        <w:pStyle w:val="ListParagraph"/>
+        <w:jc w:val="center"/>
+      </w:pPr>
       <w:r>
         <w:rPr>
           <w:noProof/>
         </w:rPr>
-        <w:t xml:space="preserve"> </w:t>
-      </w:r>
-      <w:r>
-        <w:rPr>
-          <w:noProof/>
-        </w:rPr>
         <w:drawing>
-          <wp:inline distT="0" distB="0" distL="0" distR="0" wp14:anchorId="0AD8E133" wp14:editId="05654738">
-            <wp:extent cx="2630466" cy="1701940"/>
-            <wp:effectExtent l="0" t="0" r="0" b="0"/>
+          <wp:inline distT="0" distB="0" distL="0" distR="0" wp14:anchorId="0AD8E133" wp14:editId="546E2792">
+            <wp:extent cx="3764186" cy="2435469"/>
+            <wp:effectExtent l="0" t="0" r="8255" b="3175"/>
             <wp:docPr id="1518787111" name="그림 1" descr="스크린샷, 멀티미디어 소프트웨어, 컴퓨터, 그래픽 소프트웨어이(가) 표시된 사진&#10;&#10;AI 생성 콘텐츠는 정확하지 않을 수 있습니다."/>
             <wp:cNvGraphicFramePr>
               <a:graphicFrameLocks xmlns:a="http://schemas.openxmlformats.org/drawingml/2006/main" noChangeAspect="1"/>
@@ -2296,7 +2533,7 @@
                   <pic:spPr>
                     <a:xfrm>
                       <a:off x="0" y="0"/>
-                      <a:ext cx="2676264" cy="1731572"/>
+                      <a:ext cx="3916237" cy="2533848"/>
                     </a:xfrm>
                     <a:prstGeom prst="rect">
                       <a:avLst/>
@@ -2311,7 +2548,7 @@
     </w:p>
     <w:p>
       <w:pPr>
-        <w:pStyle w:val="a6"/>
+        <w:pStyle w:val="ListParagraph"/>
         <w:numPr>
           <w:ilvl w:val="0"/>
           <w:numId w:val="2"/>
@@ -2320,10 +2557,17 @@
       </w:pPr>
       <w:r>
         <w:rPr>
+          <w:lang w:eastAsia="ko-KR"/>
+        </w:rPr>
+        <w:lastRenderedPageBreak/>
+        <w:t>C</w:t>
+      </w:r>
+      <w:r>
+        <w:rPr>
           <w:rFonts w:hint="eastAsia"/>
           <w:lang w:eastAsia="ko-KR"/>
         </w:rPr>
-        <w:t xml:space="preserve">If the images are called, click </w:t>
+        <w:t xml:space="preserve">lick </w:t>
       </w:r>
       <w:r>
         <w:rPr>
@@ -2377,28 +2621,67 @@
           <w:rFonts w:hint="eastAsia"/>
           <w:lang w:eastAsia="ko-KR"/>
         </w:rPr>
-        <w:t>. You can choose the Second Image and operation.</w:t>
-      </w:r>
+        <w:t xml:space="preserve">. You can choose the </w:t>
+      </w:r>
+      <w:r>
+        <w:rPr>
+          <w:lang w:eastAsia="ko-KR"/>
+        </w:rPr>
+        <w:t>s</w:t>
+      </w:r>
+      <w:r>
+        <w:rPr>
+          <w:rFonts w:hint="eastAsia"/>
+          <w:lang w:eastAsia="ko-KR"/>
+        </w:rPr>
+        <w:t xml:space="preserve">econd </w:t>
+      </w:r>
+      <w:r>
+        <w:rPr>
+          <w:lang w:eastAsia="ko-KR"/>
+        </w:rPr>
+        <w:t>i</w:t>
+      </w:r>
+      <w:r>
+        <w:rPr>
+          <w:rFonts w:hint="eastAsia"/>
+          <w:lang w:eastAsia="ko-KR"/>
+        </w:rPr>
+        <w:t xml:space="preserve">mage and </w:t>
+      </w:r>
+      <w:r>
+        <w:rPr>
+          <w:lang w:eastAsia="ko-KR"/>
+        </w:rPr>
+        <w:t xml:space="preserve">the </w:t>
+      </w:r>
+      <w:r>
+        <w:rPr>
+          <w:rFonts w:hint="eastAsia"/>
+          <w:lang w:eastAsia="ko-KR"/>
+        </w:rPr>
+        <w:t>operation</w:t>
+      </w:r>
+      <w:r>
+        <w:rPr>
+          <w:lang w:eastAsia="ko-KR"/>
+        </w:rPr>
+        <w:t>:</w:t>
+      </w:r>
+    </w:p>
+    <w:p>
+      <w:pPr>
+        <w:pStyle w:val="ListParagraph"/>
+        <w:jc w:val="center"/>
+      </w:pPr>
       <w:r>
         <w:rPr>
           <w:noProof/>
-        </w:rPr>
-        <w:t xml:space="preserve"> </w:t>
-      </w:r>
-    </w:p>
-    <w:p>
-      <w:pPr>
-        <w:pStyle w:val="a6"/>
-        <w:jc w:val="both"/>
-      </w:pPr>
-      <w:r>
-        <w:rPr>
-          <w:noProof/>
           <w:lang w:eastAsia="ko-KR"/>
         </w:rPr>
         <w:drawing>
-          <wp:inline distT="0" distB="0" distL="0" distR="0" wp14:anchorId="3995BB12" wp14:editId="01E1A724">
-            <wp:extent cx="3068877" cy="1772101"/>
+          <wp:inline distT="0" distB="0" distL="0" distR="0" wp14:anchorId="3995BB12" wp14:editId="51A7D1DB">
+            <wp:extent cx="3760892" cy="2171700"/>
             <wp:effectExtent l="0" t="0" r="0" b="0"/>
             <wp:docPr id="1541290022" name="그림 1" descr="텍스트, 스크린샷, 도표, 소프트웨어이(가) 표시된 사진&#10;&#10;AI 생성 콘텐츠는 정확하지 않을 수 있습니다."/>
             <wp:cNvGraphicFramePr>
@@ -2420,7 +2703,7 @@
                   <pic:spPr>
                     <a:xfrm>
                       <a:off x="0" y="0"/>
-                      <a:ext cx="3096357" cy="1787969"/>
+                      <a:ext cx="3804883" cy="2197102"/>
                     </a:xfrm>
                     <a:prstGeom prst="rect">
                       <a:avLst/>
@@ -2435,35 +2718,233 @@
     </w:p>
     <w:p>
       <w:pPr>
-        <w:pStyle w:val="a6"/>
+        <w:pStyle w:val="ListParagraph"/>
         <w:numPr>
           <w:ilvl w:val="0"/>
           <w:numId w:val="2"/>
         </w:numPr>
         <w:jc w:val="both"/>
       </w:pPr>
+      <w:r>
+        <w:rPr>
+          <w:lang w:eastAsia="ko-KR"/>
+        </w:rPr>
+        <w:t xml:space="preserve">Add </w:t>
+      </w:r>
+      <w:r>
+        <w:rPr>
+          <w:lang w:eastAsia="ko-KR"/>
+        </w:rPr>
+        <w:t>‘</w:t>
+      </w:r>
+      <w:proofErr w:type="spellStart"/>
+      <w:r>
+        <w:rPr>
+          <w:lang w:eastAsia="ko-KR"/>
+        </w:rPr>
+        <w:t>squid_</w:t>
+      </w:r>
+      <w:r>
+        <w:rPr>
+          <w:lang w:eastAsia="ko-KR"/>
+        </w:rPr>
+        <w:t>body</w:t>
+      </w:r>
+      <w:proofErr w:type="spellEnd"/>
+      <w:r>
+        <w:rPr>
+          <w:lang w:eastAsia="ko-KR"/>
+        </w:rPr>
+        <w:t>’</w:t>
+      </w:r>
+      <w:r>
+        <w:rPr>
+          <w:lang w:eastAsia="ko-KR"/>
+        </w:rPr>
+        <w:t>,</w:t>
+      </w:r>
+      <w:r>
+        <w:rPr>
+          <w:lang w:eastAsia="ko-KR"/>
+        </w:rPr>
+        <w:t xml:space="preserve"> </w:t>
+      </w:r>
+      <w:r>
+        <w:rPr>
+          <w:lang w:eastAsia="ko-KR"/>
+        </w:rPr>
+        <w:t xml:space="preserve">to </w:t>
+      </w:r>
+      <w:r>
+        <w:rPr>
+          <w:lang w:eastAsia="ko-KR"/>
+        </w:rPr>
+        <w:t>‘</w:t>
+      </w:r>
+      <w:proofErr w:type="spellStart"/>
+      <w:r>
+        <w:rPr>
+          <w:lang w:eastAsia="ko-KR"/>
+        </w:rPr>
+        <w:t>squid_</w:t>
+      </w:r>
+      <w:r>
+        <w:rPr>
+          <w:lang w:eastAsia="ko-KR"/>
+        </w:rPr>
+        <w:t>head</w:t>
+      </w:r>
+      <w:proofErr w:type="spellEnd"/>
+      <w:r>
+        <w:rPr>
+          <w:lang w:eastAsia="ko-KR"/>
+        </w:rPr>
+        <w:t>’</w:t>
+      </w:r>
+      <w:r>
+        <w:rPr>
+          <w:lang w:eastAsia="ko-KR"/>
+        </w:rPr>
+        <w:t xml:space="preserve">, then subtract </w:t>
+      </w:r>
+      <w:r>
+        <w:rPr>
+          <w:lang w:eastAsia="ko-KR"/>
+        </w:rPr>
+        <w:t>‘</w:t>
+      </w:r>
+      <w:proofErr w:type="spellStart"/>
+      <w:r>
+        <w:rPr>
+          <w:lang w:eastAsia="ko-KR"/>
+        </w:rPr>
+        <w:t>squid_points</w:t>
+      </w:r>
+      <w:proofErr w:type="spellEnd"/>
+      <w:r>
+        <w:rPr>
+          <w:lang w:eastAsia="ko-KR"/>
+        </w:rPr>
+        <w:t>’</w:t>
+      </w:r>
+      <w:r>
+        <w:rPr>
+          <w:lang w:eastAsia="ko-KR"/>
+        </w:rPr>
+        <w:t xml:space="preserve"> </w:t>
+      </w:r>
+      <w:r>
+        <w:rPr>
+          <w:lang w:eastAsia="ko-KR"/>
+        </w:rPr>
+        <w:t>from the result of this addition</w:t>
+      </w:r>
+    </w:p>
+    <w:p>
+      <w:pPr>
+        <w:pStyle w:val="ListParagraph"/>
+        <w:jc w:val="both"/>
+        <w:rPr>
+          <w:lang w:eastAsia="ko-KR"/>
+        </w:rPr>
+      </w:pPr>
+      <w:r>
+        <w:rPr>
+          <w:lang w:eastAsia="ko-KR"/>
+        </w:rPr>
+        <w:t>(</w:t>
+      </w:r>
+      <w:r>
+        <w:rPr>
+          <w:b/>
+          <w:bCs/>
+          <w:lang w:eastAsia="ko-KR"/>
+        </w:rPr>
+        <w:t>Automatic way</w:t>
+      </w:r>
+      <w:r>
+        <w:rPr>
+          <w:lang w:eastAsia="ko-KR"/>
+        </w:rPr>
+        <w:t xml:space="preserve">: </w:t>
+      </w:r>
+      <w:r>
+        <w:rPr>
+          <w:lang w:eastAsia="ko-KR"/>
+        </w:rPr>
+        <w:t>choose</w:t>
+      </w:r>
+      <w:r>
+        <w:rPr>
+          <w:lang w:eastAsia="ko-KR"/>
+        </w:rPr>
+        <w:t xml:space="preserve"> </w:t>
+      </w:r>
+      <w:r>
+        <w:rPr>
+          <w:lang w:eastAsia="ko-KR"/>
+        </w:rPr>
+        <w:t>‘</w:t>
+      </w:r>
+      <w:r>
+        <w:rPr>
+          <w:lang w:eastAsia="ko-KR"/>
+        </w:rPr>
+        <w:t>Auto Composite</w:t>
+      </w:r>
+      <w:r>
+        <w:rPr>
+          <w:lang w:eastAsia="ko-KR"/>
+        </w:rPr>
+        <w:t xml:space="preserve"> Squid Images</w:t>
+      </w:r>
+      <w:r>
+        <w:rPr>
+          <w:lang w:eastAsia="ko-KR"/>
+        </w:rPr>
+        <w:t>’</w:t>
+      </w:r>
+      <w:r>
+        <w:rPr>
+          <w:lang w:eastAsia="ko-KR"/>
+        </w:rPr>
+        <w:t xml:space="preserve"> </w:t>
+      </w:r>
+      <w:r>
+        <w:rPr>
+          <w:lang w:eastAsia="ko-KR"/>
+        </w:rPr>
+        <w:t>option)</w:t>
+      </w:r>
+    </w:p>
+    <w:p>
+      <w:pPr>
+        <w:pStyle w:val="ListParagraph"/>
+        <w:numPr>
+          <w:ilvl w:val="0"/>
+          <w:numId w:val="2"/>
+        </w:numPr>
+        <w:jc w:val="both"/>
+      </w:pPr>
       <w:proofErr w:type="gramStart"/>
       <w:r>
         <w:rPr>
-          <w:rFonts w:hint="eastAsia"/>
-          <w:lang w:eastAsia="ko-KR"/>
-        </w:rPr>
-        <w:lastRenderedPageBreak/>
-        <w:t>Final result</w:t>
+          <w:lang w:eastAsia="ko-KR"/>
+        </w:rPr>
+        <w:t>Result is</w:t>
       </w:r>
       <w:proofErr w:type="gramEnd"/>
       <w:r>
         <w:rPr>
-          <w:rFonts w:hint="eastAsia"/>
-          <w:lang w:eastAsia="ko-KR"/>
-        </w:rPr>
-        <w:t xml:space="preserve"> looks like below.</w:t>
+          <w:lang w:eastAsia="ko-KR"/>
+        </w:rPr>
+        <w:t xml:space="preserve"> shown below</w:t>
       </w:r>
     </w:p>
     <w:p>
       <w:pPr>
         <w:ind w:leftChars="300" w:left="720"/>
-        <w:jc w:val="both"/>
+        <w:jc w:val="center"/>
         <w:rPr>
           <w:lang w:eastAsia="ko-KR"/>
         </w:rPr>
@@ -2474,9 +2955,9 @@
           <w:lang w:eastAsia="ko-KR"/>
         </w:rPr>
         <w:drawing>
-          <wp:inline distT="0" distB="0" distL="0" distR="0" wp14:anchorId="7FFE6732" wp14:editId="031FD143">
-            <wp:extent cx="1290181" cy="2137368"/>
-            <wp:effectExtent l="0" t="0" r="5715" b="0"/>
+          <wp:inline distT="0" distB="0" distL="0" distR="0" wp14:anchorId="7FFE6732" wp14:editId="7D44D632">
+            <wp:extent cx="1873479" cy="3103684"/>
+            <wp:effectExtent l="0" t="0" r="0" b="1905"/>
             <wp:docPr id="2131733288" name="그림 1" descr="스크린샷, 다채로움, 그래픽이(가) 표시된 사진&#10;&#10;AI 생성 콘텐츠는 정확하지 않을 수 있습니다."/>
             <wp:cNvGraphicFramePr>
               <a:graphicFrameLocks xmlns:a="http://schemas.openxmlformats.org/drawingml/2006/main" noChangeAspect="1"/>
@@ -2497,7 +2978,7 @@
                   <pic:spPr>
                     <a:xfrm>
                       <a:off x="0" y="0"/>
-                      <a:ext cx="1310502" cy="2171032"/>
+                      <a:ext cx="1918121" cy="3177640"/>
                     </a:xfrm>
                     <a:prstGeom prst="rect">
                       <a:avLst/>
@@ -2512,10 +2993,10 @@
     </w:p>
     <w:p>
       <w:pPr>
-        <w:pStyle w:val="1"/>
-        <w:jc w:val="both"/>
-      </w:pPr>
-      <w:bookmarkStart w:id="9" w:name="_Toc209965438"/>
+        <w:pStyle w:val="Heading1"/>
+        <w:jc w:val="both"/>
+      </w:pPr>
+      <w:bookmarkStart w:id="9" w:name="_Toc211251759"/>
       <w:r>
         <w:t>Time spent</w:t>
       </w:r>
@@ -2599,21 +3080,22 @@
     </w:p>
     <w:p>
       <w:pPr>
-        <w:pStyle w:val="1"/>
-        <w:jc w:val="both"/>
-      </w:pPr>
-      <w:bookmarkStart w:id="10" w:name="_Toc209965439"/>
-      <w:r>
+        <w:pStyle w:val="Heading1"/>
+        <w:jc w:val="both"/>
+      </w:pPr>
+      <w:bookmarkStart w:id="10" w:name="_Toc211251760"/>
+      <w:r>
+        <w:lastRenderedPageBreak/>
         <w:t>Process of Project and Record of Project Meetings</w:t>
       </w:r>
       <w:bookmarkEnd w:id="10"/>
     </w:p>
     <w:p>
       <w:pPr>
-        <w:pStyle w:val="2"/>
-        <w:jc w:val="both"/>
-      </w:pPr>
-      <w:bookmarkStart w:id="11" w:name="_Toc209965440"/>
+        <w:pStyle w:val="Heading2"/>
+        <w:jc w:val="both"/>
+      </w:pPr>
+      <w:bookmarkStart w:id="11" w:name="_Toc211251761"/>
       <w:r>
         <w:t>Meeting 1 – Project Kickoff</w:t>
       </w:r>
@@ -2621,7 +3103,7 @@
     </w:p>
     <w:p>
       <w:pPr>
-        <w:pStyle w:val="a6"/>
+        <w:pStyle w:val="ListParagraph"/>
         <w:numPr>
           <w:ilvl w:val="0"/>
           <w:numId w:val="4"/>
@@ -2634,7 +3116,7 @@
     </w:p>
     <w:p>
       <w:pPr>
-        <w:pStyle w:val="a6"/>
+        <w:pStyle w:val="ListParagraph"/>
         <w:numPr>
           <w:ilvl w:val="0"/>
           <w:numId w:val="4"/>
@@ -2650,7 +3132,7 @@
     </w:p>
     <w:p>
       <w:pPr>
-        <w:pStyle w:val="a6"/>
+        <w:pStyle w:val="ListParagraph"/>
         <w:numPr>
           <w:ilvl w:val="0"/>
           <w:numId w:val="4"/>
@@ -2663,10 +3145,10 @@
     </w:p>
     <w:p>
       <w:pPr>
-        <w:pStyle w:val="2"/>
-        <w:jc w:val="both"/>
-      </w:pPr>
-      <w:bookmarkStart w:id="12" w:name="_Toc209965441"/>
+        <w:pStyle w:val="Heading2"/>
+        <w:jc w:val="both"/>
+      </w:pPr>
+      <w:bookmarkStart w:id="12" w:name="_Toc211251762"/>
       <w:r>
         <w:t>Meeting 2 – Review &amp; Integration</w:t>
       </w:r>
@@ -2674,7 +3156,7 @@
     </w:p>
     <w:p>
       <w:pPr>
-        <w:pStyle w:val="a6"/>
+        <w:pStyle w:val="ListParagraph"/>
         <w:numPr>
           <w:ilvl w:val="0"/>
           <w:numId w:val="5"/>
@@ -2687,7 +3169,7 @@
     </w:p>
     <w:p>
       <w:pPr>
-        <w:pStyle w:val="a6"/>
+        <w:pStyle w:val="ListParagraph"/>
         <w:numPr>
           <w:ilvl w:val="0"/>
           <w:numId w:val="5"/>
@@ -2700,7 +3182,7 @@
     </w:p>
     <w:p>
       <w:pPr>
-        <w:pStyle w:val="a6"/>
+        <w:pStyle w:val="ListParagraph"/>
         <w:numPr>
           <w:ilvl w:val="0"/>
           <w:numId w:val="5"/>
@@ -2713,7 +3195,7 @@
     </w:p>
     <w:p>
       <w:pPr>
-        <w:pStyle w:val="a6"/>
+        <w:pStyle w:val="ListParagraph"/>
         <w:numPr>
           <w:ilvl w:val="0"/>
           <w:numId w:val="5"/>
@@ -2726,10 +3208,10 @@
     </w:p>
     <w:p>
       <w:pPr>
-        <w:pStyle w:val="2"/>
-        <w:jc w:val="both"/>
-      </w:pPr>
-      <w:bookmarkStart w:id="13" w:name="_Toc209965442"/>
+        <w:pStyle w:val="Heading2"/>
+        <w:jc w:val="both"/>
+      </w:pPr>
+      <w:bookmarkStart w:id="13" w:name="_Toc211251763"/>
       <w:r>
         <w:t>Records</w:t>
       </w:r>
@@ -2737,33 +3219,7 @@
     </w:p>
     <w:p>
       <w:pPr>
-        <w:pStyle w:val="a6"/>
-        <w:numPr>
-          <w:ilvl w:val="0"/>
-          <w:numId w:val="6"/>
-        </w:numPr>
-        <w:jc w:val="both"/>
-      </w:pPr>
-      <w:r>
-        <w:t>TODO: KakaoTalk screenshots</w:t>
-      </w:r>
-    </w:p>
-    <w:p>
-      <w:pPr>
-        <w:pStyle w:val="a6"/>
-        <w:numPr>
-          <w:ilvl w:val="0"/>
-          <w:numId w:val="6"/>
-        </w:numPr>
-        <w:jc w:val="both"/>
-      </w:pPr>
-      <w:r>
-        <w:t>Example: discussion on how to handle overflow/underflow</w:t>
-      </w:r>
-    </w:p>
-    <w:p>
-      <w:pPr>
-        <w:pStyle w:val="a6"/>
+        <w:pStyle w:val="ListParagraph"/>
         <w:numPr>
           <w:ilvl w:val="0"/>
           <w:numId w:val="9"/>
@@ -2775,23 +3231,32 @@
           <w:rFonts w:hint="eastAsia"/>
           <w:lang w:eastAsia="ko-KR"/>
         </w:rPr>
-        <w:lastRenderedPageBreak/>
         <w:t>Adjusting schedule</w:t>
       </w:r>
     </w:p>
     <w:p>
       <w:pPr>
-        <w:pStyle w:val="a6"/>
-        <w:jc w:val="both"/>
-      </w:pPr>
-      <w:r>
+        <w:pStyle w:val="ListParagraph"/>
+        <w:jc w:val="center"/>
         <w:rPr>
           <w:noProof/>
           <w:lang w:eastAsia="ko-KR"/>
         </w:rPr>
+      </w:pPr>
+    </w:p>
+    <w:p>
+      <w:pPr>
+        <w:pStyle w:val="ListParagraph"/>
+        <w:jc w:val="center"/>
+      </w:pPr>
+      <w:r>
+        <w:rPr>
+          <w:noProof/>
+          <w:lang w:eastAsia="ko-KR"/>
+        </w:rPr>
         <w:drawing>
-          <wp:inline distT="0" distB="0" distL="0" distR="0" wp14:anchorId="3047C4F1" wp14:editId="4C5B16A2">
-            <wp:extent cx="2442575" cy="3950832"/>
+          <wp:inline distT="0" distB="0" distL="0" distR="0" wp14:anchorId="3047C4F1" wp14:editId="7F21DE83">
+            <wp:extent cx="2628900" cy="1549951"/>
             <wp:effectExtent l="0" t="0" r="0" b="0"/>
             <wp:docPr id="733733043" name="그림 1" descr="텍스트, 스크린샷, 웹사이트, 웹 페이지이(가) 표시된 사진&#10;&#10;AI 생성 콘텐츠는 정확하지 않을 수 있습니다."/>
             <wp:cNvGraphicFramePr>
@@ -2804,20 +3269,29 @@
                     <pic:cNvPr id="733733043" name="그림 1" descr="텍스트, 스크린샷, 웹사이트, 웹 페이지이(가) 표시된 사진&#10;&#10;AI 생성 콘텐츠는 정확하지 않을 수 있습니다."/>
                     <pic:cNvPicPr/>
                   </pic:nvPicPr>
-                  <pic:blipFill>
+                  <pic:blipFill rotWithShape="1">
                     <a:blip r:embed="rId15"/>
+                    <a:srcRect t="63549"/>
                     <a:stretch>
                       <a:fillRect/>
                     </a:stretch>
                   </pic:blipFill>
-                  <pic:spPr>
+                  <pic:spPr bwMode="auto">
                     <a:xfrm>
                       <a:off x="0" y="0"/>
-                      <a:ext cx="2448785" cy="3960876"/>
+                      <a:ext cx="2663065" cy="1570094"/>
                     </a:xfrm>
                     <a:prstGeom prst="rect">
                       <a:avLst/>
                     </a:prstGeom>
+                    <a:ln>
+                      <a:noFill/>
+                    </a:ln>
+                    <a:extLst>
+                      <a:ext uri="{53640926-AAD7-44D8-BBD7-CCE9431645EC}">
+                        <a14:shadowObscured xmlns:a14="http://schemas.microsoft.com/office/drawing/2010/main"/>
+                      </a:ext>
+                    </a:extLst>
                   </pic:spPr>
                 </pic:pic>
               </a:graphicData>
@@ -2828,7 +3302,13 @@
     </w:p>
     <w:p>
       <w:pPr>
-        <w:pStyle w:val="a6"/>
+        <w:pStyle w:val="ListParagraph"/>
+        <w:jc w:val="both"/>
+      </w:pPr>
+    </w:p>
+    <w:p>
+      <w:pPr>
+        <w:pStyle w:val="ListParagraph"/>
         <w:numPr>
           <w:ilvl w:val="0"/>
           <w:numId w:val="9"/>
@@ -2853,7 +3333,7 @@
     <w:p>
       <w:pPr>
         <w:ind w:leftChars="300" w:left="720"/>
-        <w:jc w:val="both"/>
+        <w:jc w:val="center"/>
         <w:rPr>
           <w:lang w:eastAsia="ko-KR"/>
         </w:rPr>
@@ -2864,9 +3344,9 @@
           <w:lang w:eastAsia="ko-KR"/>
         </w:rPr>
         <w:drawing>
-          <wp:inline distT="0" distB="0" distL="0" distR="0" wp14:anchorId="28392541" wp14:editId="3C92E276">
-            <wp:extent cx="2442210" cy="2621785"/>
-            <wp:effectExtent l="0" t="0" r="0" b="7620"/>
+          <wp:inline distT="0" distB="0" distL="0" distR="0" wp14:anchorId="28392541" wp14:editId="0930D331">
+            <wp:extent cx="2629021" cy="2822331"/>
+            <wp:effectExtent l="0" t="0" r="0" b="0"/>
             <wp:docPr id="1715088586" name="그림 1" descr="텍스트, 스크린샷이(가) 표시된 사진&#10;&#10;AI 생성 콘텐츠는 정확하지 않을 수 있습니다."/>
             <wp:cNvGraphicFramePr>
               <a:graphicFrameLocks xmlns:a="http://schemas.openxmlformats.org/drawingml/2006/main" noChangeAspect="1"/>
@@ -2887,7 +3367,7 @@
                   <pic:spPr>
                     <a:xfrm>
                       <a:off x="0" y="0"/>
-                      <a:ext cx="2455119" cy="2635643"/>
+                      <a:ext cx="2659572" cy="2855129"/>
                     </a:xfrm>
                     <a:prstGeom prst="rect">
                       <a:avLst/>
@@ -2902,7 +3382,7 @@
     </w:p>
     <w:p>
       <w:pPr>
-        <w:pStyle w:val="a6"/>
+        <w:pStyle w:val="ListParagraph"/>
         <w:numPr>
           <w:ilvl w:val="0"/>
           <w:numId w:val="9"/>
@@ -2917,23 +3397,23 @@
           <w:rFonts w:hint="eastAsia"/>
           <w:lang w:eastAsia="ko-KR"/>
         </w:rPr>
+        <w:lastRenderedPageBreak/>
         <w:t>Next step</w:t>
       </w:r>
     </w:p>
     <w:p>
       <w:pPr>
-        <w:pStyle w:val="2"/>
-        <w:jc w:val="both"/>
-        <w:rPr>
-          <w:lang w:eastAsia="ko-KR"/>
-        </w:rPr>
-      </w:pPr>
-      <w:bookmarkStart w:id="14" w:name="_Toc209965443"/>
-      <w:r>
-        <w:rPr>
-          <w:lang w:eastAsia="ko-KR"/>
-        </w:rPr>
-        <w:lastRenderedPageBreak/>
+        <w:pStyle w:val="Heading2"/>
+        <w:jc w:val="both"/>
+        <w:rPr>
+          <w:lang w:eastAsia="ko-KR"/>
+        </w:rPr>
+      </w:pPr>
+      <w:bookmarkStart w:id="14" w:name="_Toc211251764"/>
+      <w:r>
+        <w:rPr>
+          <w:lang w:eastAsia="ko-KR"/>
+        </w:rPr>
         <w:t>GitHub</w:t>
       </w:r>
       <w:r>
@@ -3025,10 +3505,10 @@
     </w:p>
     <w:p>
       <w:pPr>
-        <w:pStyle w:val="1"/>
-        <w:jc w:val="both"/>
-      </w:pPr>
-      <w:bookmarkStart w:id="15" w:name="_Toc209965444"/>
+        <w:pStyle w:val="Heading1"/>
+        <w:jc w:val="both"/>
+      </w:pPr>
+      <w:bookmarkStart w:id="15" w:name="_Toc211251765"/>
       <w:r>
         <w:t>Member's Thoughts on This Project</w:t>
       </w:r>
@@ -3036,10 +3516,10 @@
     </w:p>
     <w:p>
       <w:pPr>
-        <w:pStyle w:val="2"/>
-        <w:jc w:val="both"/>
-      </w:pPr>
-      <w:bookmarkStart w:id="16" w:name="_Toc209965445"/>
+        <w:pStyle w:val="Heading2"/>
+        <w:jc w:val="both"/>
+      </w:pPr>
+      <w:bookmarkStart w:id="16" w:name="_Toc211251766"/>
       <w:r>
         <w:t>Lessons Learned</w:t>
       </w:r>
@@ -3047,7 +3527,7 @@
     </w:p>
     <w:p>
       <w:pPr>
-        <w:pStyle w:val="a6"/>
+        <w:pStyle w:val="ListParagraph"/>
         <w:numPr>
           <w:ilvl w:val="0"/>
           <w:numId w:val="7"/>
@@ -3060,7 +3540,7 @@
     </w:p>
     <w:p>
       <w:pPr>
-        <w:pStyle w:val="a6"/>
+        <w:pStyle w:val="ListParagraph"/>
         <w:numPr>
           <w:ilvl w:val="0"/>
           <w:numId w:val="7"/>
@@ -3073,7 +3553,7 @@
     </w:p>
     <w:p>
       <w:pPr>
-        <w:pStyle w:val="a6"/>
+        <w:pStyle w:val="ListParagraph"/>
         <w:numPr>
           <w:ilvl w:val="0"/>
           <w:numId w:val="7"/>
@@ -3086,10 +3566,10 @@
     </w:p>
     <w:p>
       <w:pPr>
-        <w:pStyle w:val="2"/>
-        <w:jc w:val="both"/>
-      </w:pPr>
-      <w:bookmarkStart w:id="17" w:name="_Toc209965446"/>
+        <w:pStyle w:val="Heading2"/>
+        <w:jc w:val="both"/>
+      </w:pPr>
+      <w:bookmarkStart w:id="17" w:name="_Toc211251767"/>
       <w:r>
         <w:t>Future Improvements</w:t>
       </w:r>
@@ -3097,7 +3577,7 @@
     </w:p>
     <w:p>
       <w:pPr>
-        <w:pStyle w:val="a6"/>
+        <w:pStyle w:val="ListParagraph"/>
         <w:numPr>
           <w:ilvl w:val="0"/>
           <w:numId w:val="8"/>
@@ -3118,7 +3598,7 @@
     </w:p>
     <w:p>
       <w:pPr>
-        <w:pStyle w:val="a6"/>
+        <w:pStyle w:val="ListParagraph"/>
         <w:numPr>
           <w:ilvl w:val="0"/>
           <w:numId w:val="8"/>
@@ -3176,7 +3656,7 @@
 <w:ftr xmlns:wpc="http://schemas.microsoft.com/office/word/2010/wordprocessingCanvas" xmlns:cx="http://schemas.microsoft.com/office/drawing/2014/chartex" xmlns:cx1="http://schemas.microsoft.com/office/drawing/2015/9/8/chartex" xmlns:cx2="http://schemas.microsoft.com/office/drawing/2015/10/21/chartex" xmlns:cx3="http://schemas.microsoft.com/office/drawing/2016/5/9/chartex" xmlns:cx4="http://schemas.microsoft.com/office/drawing/2016/5/10/chartex" xmlns:cx5="http://schemas.microsoft.com/office/drawing/2016/5/11/chartex" xmlns:cx6="http://schemas.microsoft.com/office/drawing/2016/5/12/chartex" xmlns:cx7="http://schemas.microsoft.com/office/drawing/2016/5/13/chartex" xmlns:cx8="http://schemas.microsoft.com/office/drawing/2016/5/14/chartex" xmlns:mc="http://schemas.openxmlformats.org/markup-compatibility/2006" xmlns:aink="http://schemas.microsoft.com/office/drawing/2016/ink" xmlns:am3d="http://schemas.microsoft.com/office/drawing/2017/model3d" xmlns:o="urn:schemas-microsoft-com:office:office" xmlns:oel="http://schemas.microsoft.com/office/2019/extlst" xmlns:r="http://schemas.openxmlformats.org/officeDocument/2006/relationships" xmlns:m="http://schemas.openxmlformats.org/officeDocument/2006/math" xmlns:v="urn:schemas-microsoft-com:vml" xmlns:wp14="http://schemas.microsoft.com/office/word/2010/wordprocessingDrawing" xmlns:wp="http://schemas.openxmlformats.org/drawingml/2006/wordprocessingDrawing" xmlns:w10="urn:schemas-microsoft-com:office:word" xmlns:w="http://schemas.openxmlformats.org/wordprocessingml/2006/main" xmlns:w14="http://schemas.microsoft.com/office/word/2010/wordml" xmlns:w15="http://schemas.microsoft.com/office/word/2012/wordml" xmlns:w16cex="http://schemas.microsoft.com/office/word/2018/wordml/cex" xmlns:w16cid="http://schemas.microsoft.com/office/word/2016/wordml/cid" xmlns:w16="http://schemas.microsoft.com/office/word/2018/wordml" xmlns:w16du="http://schemas.microsoft.com/office/word/2023/wordml/word16du" xmlns:w16sdtdh="http://schemas.microsoft.com/office/word/2020/wordml/sdtdatahash" xmlns:w16sdtfl="http://schemas.microsoft.com/office/word/2024/wordml/sdtformatlock" xmlns:w16se="http://schemas.microsoft.com/office/word/2015/wordml/symex" xmlns:wpg="http://schemas.microsoft.com/office/word/2010/wordprocessingGroup" xmlns:wpi="http://schemas.microsoft.com/office/word/2010/wordprocessingInk" xmlns:wne="http://schemas.microsoft.com/office/word/2006/wordml" xmlns:wps="http://schemas.microsoft.com/office/word/2010/wordprocessingShape" mc:Ignorable="w14 w15 w16se w16cid w16 w16cex w16sdtdh w16sdtfl w16du wp14">
   <w:p>
     <w:pPr>
-      <w:pStyle w:val="ad"/>
+      <w:pStyle w:val="Footer"/>
     </w:pPr>
   </w:p>
 </w:ftr>
@@ -3186,7 +3666,7 @@
 <w:ftr xmlns:wpc="http://schemas.microsoft.com/office/word/2010/wordprocessingCanvas" xmlns:cx="http://schemas.microsoft.com/office/drawing/2014/chartex" xmlns:cx1="http://schemas.microsoft.com/office/drawing/2015/9/8/chartex" xmlns:cx2="http://schemas.microsoft.com/office/drawing/2015/10/21/chartex" xmlns:cx3="http://schemas.microsoft.com/office/drawing/2016/5/9/chartex" xmlns:cx4="http://schemas.microsoft.com/office/drawing/2016/5/10/chartex" xmlns:cx5="http://schemas.microsoft.com/office/drawing/2016/5/11/chartex" xmlns:cx6="http://schemas.microsoft.com/office/drawing/2016/5/12/chartex" xmlns:cx7="http://schemas.microsoft.com/office/drawing/2016/5/13/chartex" xmlns:cx8="http://schemas.microsoft.com/office/drawing/2016/5/14/chartex" xmlns:mc="http://schemas.openxmlformats.org/markup-compatibility/2006" xmlns:aink="http://schemas.microsoft.com/office/drawing/2016/ink" xmlns:am3d="http://schemas.microsoft.com/office/drawing/2017/model3d" xmlns:o="urn:schemas-microsoft-com:office:office" xmlns:oel="http://schemas.microsoft.com/office/2019/extlst" xmlns:r="http://schemas.openxmlformats.org/officeDocument/2006/relationships" xmlns:m="http://schemas.openxmlformats.org/officeDocument/2006/math" xmlns:v="urn:schemas-microsoft-com:vml" xmlns:wp14="http://schemas.microsoft.com/office/word/2010/wordprocessingDrawing" xmlns:wp="http://schemas.openxmlformats.org/drawingml/2006/wordprocessingDrawing" xmlns:w10="urn:schemas-microsoft-com:office:word" xmlns:w="http://schemas.openxmlformats.org/wordprocessingml/2006/main" xmlns:w14="http://schemas.microsoft.com/office/word/2010/wordml" xmlns:w15="http://schemas.microsoft.com/office/word/2012/wordml" xmlns:w16cex="http://schemas.microsoft.com/office/word/2018/wordml/cex" xmlns:w16cid="http://schemas.microsoft.com/office/word/2016/wordml/cid" xmlns:w16="http://schemas.microsoft.com/office/word/2018/wordml" xmlns:w16du="http://schemas.microsoft.com/office/word/2023/wordml/word16du" xmlns:w16sdtdh="http://schemas.microsoft.com/office/word/2020/wordml/sdtdatahash" xmlns:w16sdtfl="http://schemas.microsoft.com/office/word/2024/wordml/sdtformatlock" xmlns:w16se="http://schemas.microsoft.com/office/word/2015/wordml/symex" xmlns:wpg="http://schemas.microsoft.com/office/word/2010/wordprocessingGroup" xmlns:wpi="http://schemas.microsoft.com/office/word/2010/wordprocessingInk" xmlns:wne="http://schemas.microsoft.com/office/word/2006/wordml" xmlns:wps="http://schemas.microsoft.com/office/word/2010/wordprocessingShape" mc:Ignorable="w14 w15 w16se w16cid w16 w16cex w16sdtdh w16sdtfl w16du wp14">
   <w:p>
     <w:pPr>
-      <w:pStyle w:val="ad"/>
+      <w:pStyle w:val="Footer"/>
     </w:pPr>
   </w:p>
 </w:ftr>
@@ -3196,7 +3676,7 @@
 <w:ftr xmlns:wpc="http://schemas.microsoft.com/office/word/2010/wordprocessingCanvas" xmlns:cx="http://schemas.microsoft.com/office/drawing/2014/chartex" xmlns:cx1="http://schemas.microsoft.com/office/drawing/2015/9/8/chartex" xmlns:cx2="http://schemas.microsoft.com/office/drawing/2015/10/21/chartex" xmlns:cx3="http://schemas.microsoft.com/office/drawing/2016/5/9/chartex" xmlns:cx4="http://schemas.microsoft.com/office/drawing/2016/5/10/chartex" xmlns:cx5="http://schemas.microsoft.com/office/drawing/2016/5/11/chartex" xmlns:cx6="http://schemas.microsoft.com/office/drawing/2016/5/12/chartex" xmlns:cx7="http://schemas.microsoft.com/office/drawing/2016/5/13/chartex" xmlns:cx8="http://schemas.microsoft.com/office/drawing/2016/5/14/chartex" xmlns:mc="http://schemas.openxmlformats.org/markup-compatibility/2006" xmlns:aink="http://schemas.microsoft.com/office/drawing/2016/ink" xmlns:am3d="http://schemas.microsoft.com/office/drawing/2017/model3d" xmlns:o="urn:schemas-microsoft-com:office:office" xmlns:oel="http://schemas.microsoft.com/office/2019/extlst" xmlns:r="http://schemas.openxmlformats.org/officeDocument/2006/relationships" xmlns:m="http://schemas.openxmlformats.org/officeDocument/2006/math" xmlns:v="urn:schemas-microsoft-com:vml" xmlns:wp14="http://schemas.microsoft.com/office/word/2010/wordprocessingDrawing" xmlns:wp="http://schemas.openxmlformats.org/drawingml/2006/wordprocessingDrawing" xmlns:w10="urn:schemas-microsoft-com:office:word" xmlns:w="http://schemas.openxmlformats.org/wordprocessingml/2006/main" xmlns:w14="http://schemas.microsoft.com/office/word/2010/wordml" xmlns:w15="http://schemas.microsoft.com/office/word/2012/wordml" xmlns:w16cex="http://schemas.microsoft.com/office/word/2018/wordml/cex" xmlns:w16cid="http://schemas.microsoft.com/office/word/2016/wordml/cid" xmlns:w16="http://schemas.microsoft.com/office/word/2018/wordml" xmlns:w16du="http://schemas.microsoft.com/office/word/2023/wordml/word16du" xmlns:w16sdtdh="http://schemas.microsoft.com/office/word/2020/wordml/sdtdatahash" xmlns:w16sdtfl="http://schemas.microsoft.com/office/word/2024/wordml/sdtformatlock" xmlns:w16se="http://schemas.microsoft.com/office/word/2015/wordml/symex" xmlns:wpg="http://schemas.microsoft.com/office/word/2010/wordprocessingGroup" xmlns:wpi="http://schemas.microsoft.com/office/word/2010/wordprocessingInk" xmlns:wne="http://schemas.microsoft.com/office/word/2006/wordml" xmlns:wps="http://schemas.microsoft.com/office/word/2010/wordprocessingShape" mc:Ignorable="w14 w15 w16se w16cid w16 w16cex w16sdtdh w16sdtfl w16du wp14">
   <w:p>
     <w:pPr>
-      <w:pStyle w:val="ad"/>
+      <w:pStyle w:val="Footer"/>
       <w:rPr>
         <w:lang w:eastAsia="ko-KR"/>
       </w:rPr>
@@ -3204,7 +3684,7 @@
   </w:p>
   <w:p>
     <w:pPr>
-      <w:pStyle w:val="ad"/>
+      <w:pStyle w:val="Footer"/>
       <w:rPr>
         <w:lang w:eastAsia="ko-KR"/>
       </w:rPr>
@@ -3212,7 +3692,7 @@
   </w:p>
   <w:p>
     <w:pPr>
-      <w:pStyle w:val="ad"/>
+      <w:pStyle w:val="Footer"/>
       <w:rPr>
         <w:lang w:eastAsia="ko-KR"/>
       </w:rPr>
@@ -3250,7 +3730,7 @@
 <w:hdr xmlns:wpc="http://schemas.microsoft.com/office/word/2010/wordprocessingCanvas" xmlns:cx="http://schemas.microsoft.com/office/drawing/2014/chartex" xmlns:cx1="http://schemas.microsoft.com/office/drawing/2015/9/8/chartex" xmlns:cx2="http://schemas.microsoft.com/office/drawing/2015/10/21/chartex" xmlns:cx3="http://schemas.microsoft.com/office/drawing/2016/5/9/chartex" xmlns:cx4="http://schemas.microsoft.com/office/drawing/2016/5/10/chartex" xmlns:cx5="http://schemas.microsoft.com/office/drawing/2016/5/11/chartex" xmlns:cx6="http://schemas.microsoft.com/office/drawing/2016/5/12/chartex" xmlns:cx7="http://schemas.microsoft.com/office/drawing/2016/5/13/chartex" xmlns:cx8="http://schemas.microsoft.com/office/drawing/2016/5/14/chartex" xmlns:mc="http://schemas.openxmlformats.org/markup-compatibility/2006" xmlns:aink="http://schemas.microsoft.com/office/drawing/2016/ink" xmlns:am3d="http://schemas.microsoft.com/office/drawing/2017/model3d" xmlns:o="urn:schemas-microsoft-com:office:office" xmlns:oel="http://schemas.microsoft.com/office/2019/extlst" xmlns:r="http://schemas.openxmlformats.org/officeDocument/2006/relationships" xmlns:m="http://schemas.openxmlformats.org/officeDocument/2006/math" xmlns:v="urn:schemas-microsoft-com:vml" xmlns:wp14="http://schemas.microsoft.com/office/word/2010/wordprocessingDrawing" xmlns:wp="http://schemas.openxmlformats.org/drawingml/2006/wordprocessingDrawing" xmlns:w10="urn:schemas-microsoft-com:office:word" xmlns:w="http://schemas.openxmlformats.org/wordprocessingml/2006/main" xmlns:w14="http://schemas.microsoft.com/office/word/2010/wordml" xmlns:w15="http://schemas.microsoft.com/office/word/2012/wordml" xmlns:w16cex="http://schemas.microsoft.com/office/word/2018/wordml/cex" xmlns:w16cid="http://schemas.microsoft.com/office/word/2016/wordml/cid" xmlns:w16="http://schemas.microsoft.com/office/word/2018/wordml" xmlns:w16du="http://schemas.microsoft.com/office/word/2023/wordml/word16du" xmlns:w16sdtdh="http://schemas.microsoft.com/office/word/2020/wordml/sdtdatahash" xmlns:w16sdtfl="http://schemas.microsoft.com/office/word/2024/wordml/sdtformatlock" xmlns:w16se="http://schemas.microsoft.com/office/word/2015/wordml/symex" xmlns:wpg="http://schemas.microsoft.com/office/word/2010/wordprocessingGroup" xmlns:wpi="http://schemas.microsoft.com/office/word/2010/wordprocessingInk" xmlns:wne="http://schemas.microsoft.com/office/word/2006/wordml" xmlns:wps="http://schemas.microsoft.com/office/word/2010/wordprocessingShape" mc:Ignorable="w14 w15 w16se w16cid w16 w16cex w16sdtdh w16sdtfl w16du wp14">
   <w:p>
     <w:pPr>
-      <w:pStyle w:val="ac"/>
+      <w:pStyle w:val="Header"/>
     </w:pPr>
   </w:p>
 </w:hdr>
@@ -3260,7 +3740,7 @@
 <w:hdr xmlns:wpc="http://schemas.microsoft.com/office/word/2010/wordprocessingCanvas" xmlns:cx="http://schemas.microsoft.com/office/drawing/2014/chartex" xmlns:cx1="http://schemas.microsoft.com/office/drawing/2015/9/8/chartex" xmlns:cx2="http://schemas.microsoft.com/office/drawing/2015/10/21/chartex" xmlns:cx3="http://schemas.microsoft.com/office/drawing/2016/5/9/chartex" xmlns:cx4="http://schemas.microsoft.com/office/drawing/2016/5/10/chartex" xmlns:cx5="http://schemas.microsoft.com/office/drawing/2016/5/11/chartex" xmlns:cx6="http://schemas.microsoft.com/office/drawing/2016/5/12/chartex" xmlns:cx7="http://schemas.microsoft.com/office/drawing/2016/5/13/chartex" xmlns:cx8="http://schemas.microsoft.com/office/drawing/2016/5/14/chartex" xmlns:mc="http://schemas.openxmlformats.org/markup-compatibility/2006" xmlns:aink="http://schemas.microsoft.com/office/drawing/2016/ink" xmlns:am3d="http://schemas.microsoft.com/office/drawing/2017/model3d" xmlns:o="urn:schemas-microsoft-com:office:office" xmlns:oel="http://schemas.microsoft.com/office/2019/extlst" xmlns:r="http://schemas.openxmlformats.org/officeDocument/2006/relationships" xmlns:m="http://schemas.openxmlformats.org/officeDocument/2006/math" xmlns:v="urn:schemas-microsoft-com:vml" xmlns:wp14="http://schemas.microsoft.com/office/word/2010/wordprocessingDrawing" xmlns:wp="http://schemas.openxmlformats.org/drawingml/2006/wordprocessingDrawing" xmlns:w10="urn:schemas-microsoft-com:office:word" xmlns:w="http://schemas.openxmlformats.org/wordprocessingml/2006/main" xmlns:w14="http://schemas.microsoft.com/office/word/2010/wordml" xmlns:w15="http://schemas.microsoft.com/office/word/2012/wordml" xmlns:w16cex="http://schemas.microsoft.com/office/word/2018/wordml/cex" xmlns:w16cid="http://schemas.microsoft.com/office/word/2016/wordml/cid" xmlns:w16="http://schemas.microsoft.com/office/word/2018/wordml" xmlns:w16du="http://schemas.microsoft.com/office/word/2023/wordml/word16du" xmlns:w16sdtdh="http://schemas.microsoft.com/office/word/2020/wordml/sdtdatahash" xmlns:w16sdtfl="http://schemas.microsoft.com/office/word/2024/wordml/sdtformatlock" xmlns:w16se="http://schemas.microsoft.com/office/word/2015/wordml/symex" xmlns:wpg="http://schemas.microsoft.com/office/word/2010/wordprocessingGroup" xmlns:wpi="http://schemas.microsoft.com/office/word/2010/wordprocessingInk" xmlns:wne="http://schemas.microsoft.com/office/word/2006/wordml" xmlns:wps="http://schemas.microsoft.com/office/word/2010/wordprocessingShape" mc:Ignorable="w14 w15 w16se w16cid w16 w16cex w16sdtdh w16sdtfl w16du wp14">
   <w:p>
     <w:pPr>
-      <w:pStyle w:val="ac"/>
+      <w:pStyle w:val="Header"/>
     </w:pPr>
   </w:p>
 </w:hdr>
@@ -3270,7 +3750,7 @@
 <w:hdr xmlns:wpc="http://schemas.microsoft.com/office/word/2010/wordprocessingCanvas" xmlns:cx="http://schemas.microsoft.com/office/drawing/2014/chartex" xmlns:cx1="http://schemas.microsoft.com/office/drawing/2015/9/8/chartex" xmlns:cx2="http://schemas.microsoft.com/office/drawing/2015/10/21/chartex" xmlns:cx3="http://schemas.microsoft.com/office/drawing/2016/5/9/chartex" xmlns:cx4="http://schemas.microsoft.com/office/drawing/2016/5/10/chartex" xmlns:cx5="http://schemas.microsoft.com/office/drawing/2016/5/11/chartex" xmlns:cx6="http://schemas.microsoft.com/office/drawing/2016/5/12/chartex" xmlns:cx7="http://schemas.microsoft.com/office/drawing/2016/5/13/chartex" xmlns:cx8="http://schemas.microsoft.com/office/drawing/2016/5/14/chartex" xmlns:mc="http://schemas.openxmlformats.org/markup-compatibility/2006" xmlns:aink="http://schemas.microsoft.com/office/drawing/2016/ink" xmlns:am3d="http://schemas.microsoft.com/office/drawing/2017/model3d" xmlns:o="urn:schemas-microsoft-com:office:office" xmlns:oel="http://schemas.microsoft.com/office/2019/extlst" xmlns:r="http://schemas.openxmlformats.org/officeDocument/2006/relationships" xmlns:m="http://schemas.openxmlformats.org/officeDocument/2006/math" xmlns:v="urn:schemas-microsoft-com:vml" xmlns:wp14="http://schemas.microsoft.com/office/word/2010/wordprocessingDrawing" xmlns:wp="http://schemas.openxmlformats.org/drawingml/2006/wordprocessingDrawing" xmlns:w10="urn:schemas-microsoft-com:office:word" xmlns:w="http://schemas.openxmlformats.org/wordprocessingml/2006/main" xmlns:w14="http://schemas.microsoft.com/office/word/2010/wordml" xmlns:w15="http://schemas.microsoft.com/office/word/2012/wordml" xmlns:w16cex="http://schemas.microsoft.com/office/word/2018/wordml/cex" xmlns:w16cid="http://schemas.microsoft.com/office/word/2016/wordml/cid" xmlns:w16="http://schemas.microsoft.com/office/word/2018/wordml" xmlns:w16du="http://schemas.microsoft.com/office/word/2023/wordml/word16du" xmlns:w16sdtdh="http://schemas.microsoft.com/office/word/2020/wordml/sdtdatahash" xmlns:w16sdtfl="http://schemas.microsoft.com/office/word/2024/wordml/sdtformatlock" xmlns:w16se="http://schemas.microsoft.com/office/word/2015/wordml/symex" xmlns:wpg="http://schemas.microsoft.com/office/word/2010/wordprocessingGroup" xmlns:wpi="http://schemas.microsoft.com/office/word/2010/wordprocessingInk" xmlns:wne="http://schemas.microsoft.com/office/word/2006/wordml" xmlns:wps="http://schemas.microsoft.com/office/word/2010/wordprocessingShape" mc:Ignorable="w14 w15 w16se w16cid w16 w16cex w16sdtdh w16sdtfl w16du wp14">
   <w:p>
     <w:pPr>
-      <w:pStyle w:val="ac"/>
+      <w:pStyle w:val="Header"/>
     </w:pPr>
   </w:p>
 </w:hdr>
@@ -3843,6 +4323,119 @@
     </w:lvl>
   </w:abstractNum>
   <w:abstractNum w:abstractNumId="5" w15:restartNumberingAfterBreak="0">
+    <w:nsid w:val="0CCE620C"/>
+    <w:multiLevelType w:val="hybridMultilevel"/>
+    <w:tmpl w:val="55D64376"/>
+    <w:lvl w:ilvl="0" w:tplc="20000001">
+      <w:start w:val="1"/>
+      <w:numFmt w:val="bullet"/>
+      <w:lvlText w:val=""/>
+      <w:lvlJc w:val="left"/>
+      <w:pPr>
+        <w:ind w:left="720" w:hanging="360"/>
+      </w:pPr>
+      <w:rPr>
+        <w:rFonts w:ascii="Symbol" w:hAnsi="Symbol" w:hint="default"/>
+      </w:rPr>
+    </w:lvl>
+    <w:lvl w:ilvl="1" w:tplc="20000003" w:tentative="1">
+      <w:start w:val="1"/>
+      <w:numFmt w:val="bullet"/>
+      <w:lvlText w:val="o"/>
+      <w:lvlJc w:val="left"/>
+      <w:pPr>
+        <w:ind w:left="1440" w:hanging="360"/>
+      </w:pPr>
+      <w:rPr>
+        <w:rFonts w:ascii="Courier New" w:hAnsi="Courier New" w:cs="Courier New" w:hint="default"/>
+      </w:rPr>
+    </w:lvl>
+    <w:lvl w:ilvl="2" w:tplc="20000005" w:tentative="1">
+      <w:start w:val="1"/>
+      <w:numFmt w:val="bullet"/>
+      <w:lvlText w:val=""/>
+      <w:lvlJc w:val="left"/>
+      <w:pPr>
+        <w:ind w:left="2160" w:hanging="360"/>
+      </w:pPr>
+      <w:rPr>
+        <w:rFonts w:ascii="Wingdings" w:hAnsi="Wingdings" w:hint="default"/>
+      </w:rPr>
+    </w:lvl>
+    <w:lvl w:ilvl="3" w:tplc="20000001" w:tentative="1">
+      <w:start w:val="1"/>
+      <w:numFmt w:val="bullet"/>
+      <w:lvlText w:val=""/>
+      <w:lvlJc w:val="left"/>
+      <w:pPr>
+        <w:ind w:left="2880" w:hanging="360"/>
+      </w:pPr>
+      <w:rPr>
+        <w:rFonts w:ascii="Symbol" w:hAnsi="Symbol" w:hint="default"/>
+      </w:rPr>
+    </w:lvl>
+    <w:lvl w:ilvl="4" w:tplc="20000003" w:tentative="1">
+      <w:start w:val="1"/>
+      <w:numFmt w:val="bullet"/>
+      <w:lvlText w:val="o"/>
+      <w:lvlJc w:val="left"/>
+      <w:pPr>
+        <w:ind w:left="3600" w:hanging="360"/>
+      </w:pPr>
+      <w:rPr>
+        <w:rFonts w:ascii="Courier New" w:hAnsi="Courier New" w:cs="Courier New" w:hint="default"/>
+      </w:rPr>
+    </w:lvl>
+    <w:lvl w:ilvl="5" w:tplc="20000005" w:tentative="1">
+      <w:start w:val="1"/>
+      <w:numFmt w:val="bullet"/>
+      <w:lvlText w:val=""/>
+      <w:lvlJc w:val="left"/>
+      <w:pPr>
+        <w:ind w:left="4320" w:hanging="360"/>
+      </w:pPr>
+      <w:rPr>
+        <w:rFonts w:ascii="Wingdings" w:hAnsi="Wingdings" w:hint="default"/>
+      </w:rPr>
+    </w:lvl>
+    <w:lvl w:ilvl="6" w:tplc="20000001" w:tentative="1">
+      <w:start w:val="1"/>
+      <w:numFmt w:val="bullet"/>
+      <w:lvlText w:val=""/>
+      <w:lvlJc w:val="left"/>
+      <w:pPr>
+        <w:ind w:left="5040" w:hanging="360"/>
+      </w:pPr>
+      <w:rPr>
+        <w:rFonts w:ascii="Symbol" w:hAnsi="Symbol" w:hint="default"/>
+      </w:rPr>
+    </w:lvl>
+    <w:lvl w:ilvl="7" w:tplc="20000003" w:tentative="1">
+      <w:start w:val="1"/>
+      <w:numFmt w:val="bullet"/>
+      <w:lvlText w:val="o"/>
+      <w:lvlJc w:val="left"/>
+      <w:pPr>
+        <w:ind w:left="5760" w:hanging="360"/>
+      </w:pPr>
+      <w:rPr>
+        <w:rFonts w:ascii="Courier New" w:hAnsi="Courier New" w:cs="Courier New" w:hint="default"/>
+      </w:rPr>
+    </w:lvl>
+    <w:lvl w:ilvl="8" w:tplc="20000005" w:tentative="1">
+      <w:start w:val="1"/>
+      <w:numFmt w:val="bullet"/>
+      <w:lvlText w:val=""/>
+      <w:lvlJc w:val="left"/>
+      <w:pPr>
+        <w:ind w:left="6480" w:hanging="360"/>
+      </w:pPr>
+      <w:rPr>
+        <w:rFonts w:ascii="Wingdings" w:hAnsi="Wingdings" w:hint="default"/>
+      </w:rPr>
+    </w:lvl>
+  </w:abstractNum>
+  <w:abstractNum w:abstractNumId="6" w15:restartNumberingAfterBreak="0">
     <w:nsid w:val="11E81777"/>
     <w:multiLevelType w:val="hybridMultilevel"/>
     <w:tmpl w:val="D4AED3DA"/>
@@ -3955,7 +4548,7 @@
       </w:rPr>
     </w:lvl>
   </w:abstractNum>
-  <w:abstractNum w:abstractNumId="6" w15:restartNumberingAfterBreak="0">
+  <w:abstractNum w:abstractNumId="7" w15:restartNumberingAfterBreak="0">
     <w:nsid w:val="50B43EC9"/>
     <w:multiLevelType w:val="hybridMultilevel"/>
     <w:tmpl w:val="DBE437C4"/>
@@ -4068,7 +4661,7 @@
       </w:rPr>
     </w:lvl>
   </w:abstractNum>
-  <w:abstractNum w:abstractNumId="7" w15:restartNumberingAfterBreak="0">
+  <w:abstractNum w:abstractNumId="8" w15:restartNumberingAfterBreak="0">
     <w:nsid w:val="526C3359"/>
     <w:multiLevelType w:val="hybridMultilevel"/>
     <w:tmpl w:val="42CAA792"/>
@@ -4181,7 +4774,7 @@
       </w:rPr>
     </w:lvl>
   </w:abstractNum>
-  <w:abstractNum w:abstractNumId="8" w15:restartNumberingAfterBreak="0">
+  <w:abstractNum w:abstractNumId="9" w15:restartNumberingAfterBreak="0">
     <w:nsid w:val="57EC420D"/>
     <w:multiLevelType w:val="hybridMultilevel"/>
     <w:tmpl w:val="87286D20"/>
@@ -4294,7 +4887,7 @@
       </w:rPr>
     </w:lvl>
   </w:abstractNum>
-  <w:abstractNum w:abstractNumId="9" w15:restartNumberingAfterBreak="0">
+  <w:abstractNum w:abstractNumId="10" w15:restartNumberingAfterBreak="0">
     <w:nsid w:val="7DA45936"/>
     <w:multiLevelType w:val="hybridMultilevel"/>
     <w:tmpl w:val="96E07EFC"/>
@@ -4384,16 +4977,16 @@
     </w:lvl>
   </w:abstractNum>
   <w:num w:numId="1" w16cid:durableId="314989882">
-    <w:abstractNumId w:val="6"/>
+    <w:abstractNumId w:val="7"/>
   </w:num>
   <w:num w:numId="2" w16cid:durableId="960913941">
     <w:abstractNumId w:val="2"/>
   </w:num>
   <w:num w:numId="3" w16cid:durableId="820078393">
-    <w:abstractNumId w:val="8"/>
+    <w:abstractNumId w:val="9"/>
   </w:num>
   <w:num w:numId="4" w16cid:durableId="619343571">
-    <w:abstractNumId w:val="7"/>
+    <w:abstractNumId w:val="8"/>
   </w:num>
   <w:num w:numId="5" w16cid:durableId="1248423025">
     <w:abstractNumId w:val="1"/>
@@ -4405,13 +4998,16 @@
     <w:abstractNumId w:val="4"/>
   </w:num>
   <w:num w:numId="8" w16cid:durableId="635719755">
-    <w:abstractNumId w:val="5"/>
+    <w:abstractNumId w:val="6"/>
   </w:num>
   <w:num w:numId="9" w16cid:durableId="697391651">
-    <w:abstractNumId w:val="9"/>
+    <w:abstractNumId w:val="10"/>
   </w:num>
   <w:num w:numId="10" w16cid:durableId="1392076842">
     <w:abstractNumId w:val="3"/>
+  </w:num>
+  <w:num w:numId="11" w16cid:durableId="1714035503">
+    <w:abstractNumId w:val="5"/>
   </w:num>
 </w:numbering>
 </file>
@@ -4813,15 +5409,15 @@
     <w:lsdException w:name="Unresolved Mention" w:semiHidden="1" w:unhideWhenUsed="1"/>
     <w:lsdException w:name="Smart Link" w:semiHidden="1" w:unhideWhenUsed="1"/>
   </w:latentStyles>
-  <w:style w:type="paragraph" w:default="1" w:styleId="a">
+  <w:style w:type="paragraph" w:default="1" w:styleId="Normal">
     <w:name w:val="Normal"/>
     <w:qFormat/>
   </w:style>
-  <w:style w:type="paragraph" w:styleId="1">
+  <w:style w:type="paragraph" w:styleId="Heading1">
     <w:name w:val="heading 1"/>
-    <w:basedOn w:val="a"/>
-    <w:next w:val="a"/>
-    <w:link w:val="1Char"/>
+    <w:basedOn w:val="Normal"/>
+    <w:next w:val="Normal"/>
+    <w:link w:val="Heading1Char"/>
     <w:uiPriority w:val="9"/>
     <w:qFormat/>
     <w:rsid w:val="009F503D"/>
@@ -4838,11 +5434,11 @@
       <w:szCs w:val="40"/>
     </w:rPr>
   </w:style>
-  <w:style w:type="paragraph" w:styleId="2">
+  <w:style w:type="paragraph" w:styleId="Heading2">
     <w:name w:val="heading 2"/>
-    <w:basedOn w:val="a"/>
-    <w:next w:val="a"/>
-    <w:link w:val="2Char"/>
+    <w:basedOn w:val="Normal"/>
+    <w:next w:val="Normal"/>
+    <w:link w:val="Heading2Char"/>
     <w:uiPriority w:val="9"/>
     <w:unhideWhenUsed/>
     <w:qFormat/>
@@ -4860,11 +5456,11 @@
       <w:szCs w:val="32"/>
     </w:rPr>
   </w:style>
-  <w:style w:type="paragraph" w:styleId="3">
+  <w:style w:type="paragraph" w:styleId="Heading3">
     <w:name w:val="heading 3"/>
-    <w:basedOn w:val="a"/>
-    <w:next w:val="a"/>
-    <w:link w:val="3Char"/>
+    <w:basedOn w:val="Normal"/>
+    <w:next w:val="Normal"/>
+    <w:link w:val="Heading3Char"/>
     <w:uiPriority w:val="9"/>
     <w:semiHidden/>
     <w:unhideWhenUsed/>
@@ -4883,11 +5479,11 @@
       <w:szCs w:val="28"/>
     </w:rPr>
   </w:style>
-  <w:style w:type="paragraph" w:styleId="4">
+  <w:style w:type="paragraph" w:styleId="Heading4">
     <w:name w:val="heading 4"/>
-    <w:basedOn w:val="a"/>
-    <w:next w:val="a"/>
-    <w:link w:val="4Char"/>
+    <w:basedOn w:val="Normal"/>
+    <w:next w:val="Normal"/>
+    <w:link w:val="Heading4Char"/>
     <w:uiPriority w:val="9"/>
     <w:semiHidden/>
     <w:unhideWhenUsed/>
@@ -4906,11 +5502,11 @@
       <w:color w:val="0F4761" w:themeColor="accent1" w:themeShade="BF"/>
     </w:rPr>
   </w:style>
-  <w:style w:type="paragraph" w:styleId="5">
+  <w:style w:type="paragraph" w:styleId="Heading5">
     <w:name w:val="heading 5"/>
-    <w:basedOn w:val="a"/>
-    <w:next w:val="a"/>
-    <w:link w:val="5Char"/>
+    <w:basedOn w:val="Normal"/>
+    <w:next w:val="Normal"/>
+    <w:link w:val="Heading5Char"/>
     <w:uiPriority w:val="9"/>
     <w:semiHidden/>
     <w:unhideWhenUsed/>
@@ -4927,11 +5523,11 @@
       <w:color w:val="0F4761" w:themeColor="accent1" w:themeShade="BF"/>
     </w:rPr>
   </w:style>
-  <w:style w:type="paragraph" w:styleId="6">
+  <w:style w:type="paragraph" w:styleId="Heading6">
     <w:name w:val="heading 6"/>
-    <w:basedOn w:val="a"/>
-    <w:next w:val="a"/>
-    <w:link w:val="6Char"/>
+    <w:basedOn w:val="Normal"/>
+    <w:next w:val="Normal"/>
+    <w:link w:val="Heading6Char"/>
     <w:uiPriority w:val="9"/>
     <w:semiHidden/>
     <w:unhideWhenUsed/>
@@ -4950,11 +5546,11 @@
       <w:color w:val="595959" w:themeColor="text1" w:themeTint="A6"/>
     </w:rPr>
   </w:style>
-  <w:style w:type="paragraph" w:styleId="7">
+  <w:style w:type="paragraph" w:styleId="Heading7">
     <w:name w:val="heading 7"/>
-    <w:basedOn w:val="a"/>
-    <w:next w:val="a"/>
-    <w:link w:val="7Char"/>
+    <w:basedOn w:val="Normal"/>
+    <w:next w:val="Normal"/>
+    <w:link w:val="Heading7Char"/>
     <w:uiPriority w:val="9"/>
     <w:semiHidden/>
     <w:unhideWhenUsed/>
@@ -4971,11 +5567,11 @@
       <w:color w:val="595959" w:themeColor="text1" w:themeTint="A6"/>
     </w:rPr>
   </w:style>
-  <w:style w:type="paragraph" w:styleId="8">
+  <w:style w:type="paragraph" w:styleId="Heading8">
     <w:name w:val="heading 8"/>
-    <w:basedOn w:val="a"/>
-    <w:next w:val="a"/>
-    <w:link w:val="8Char"/>
+    <w:basedOn w:val="Normal"/>
+    <w:next w:val="Normal"/>
+    <w:link w:val="Heading8Char"/>
     <w:uiPriority w:val="9"/>
     <w:semiHidden/>
     <w:unhideWhenUsed/>
@@ -4994,11 +5590,11 @@
       <w:color w:val="272727" w:themeColor="text1" w:themeTint="D8"/>
     </w:rPr>
   </w:style>
-  <w:style w:type="paragraph" w:styleId="9">
+  <w:style w:type="paragraph" w:styleId="Heading9">
     <w:name w:val="heading 9"/>
-    <w:basedOn w:val="a"/>
-    <w:next w:val="a"/>
-    <w:link w:val="9Char"/>
+    <w:basedOn w:val="Normal"/>
+    <w:next w:val="Normal"/>
+    <w:link w:val="Heading9Char"/>
     <w:uiPriority w:val="9"/>
     <w:semiHidden/>
     <w:unhideWhenUsed/>
@@ -5015,13 +5611,13 @@
       <w:color w:val="272727" w:themeColor="text1" w:themeTint="D8"/>
     </w:rPr>
   </w:style>
-  <w:style w:type="character" w:default="1" w:styleId="a0">
+  <w:style w:type="character" w:default="1" w:styleId="DefaultParagraphFont">
     <w:name w:val="Default Paragraph Font"/>
     <w:uiPriority w:val="1"/>
     <w:semiHidden/>
     <w:unhideWhenUsed/>
   </w:style>
-  <w:style w:type="table" w:default="1" w:styleId="a1">
+  <w:style w:type="table" w:default="1" w:styleId="TableNormal">
     <w:name w:val="Normal Table"/>
     <w:uiPriority w:val="99"/>
     <w:semiHidden/>
@@ -5036,16 +5632,16 @@
       </w:tblCellMar>
     </w:tblPr>
   </w:style>
-  <w:style w:type="numbering" w:default="1" w:styleId="a2">
+  <w:style w:type="numbering" w:default="1" w:styleId="NoList">
     <w:name w:val="No List"/>
     <w:uiPriority w:val="99"/>
     <w:semiHidden/>
     <w:unhideWhenUsed/>
   </w:style>
-  <w:style w:type="character" w:customStyle="1" w:styleId="1Char">
-    <w:name w:val="제목 1 Char"/>
-    <w:basedOn w:val="a0"/>
-    <w:link w:val="1"/>
+  <w:style w:type="character" w:customStyle="1" w:styleId="Heading1Char">
+    <w:name w:val="Heading 1 Char"/>
+    <w:basedOn w:val="DefaultParagraphFont"/>
+    <w:link w:val="Heading1"/>
     <w:uiPriority w:val="9"/>
     <w:rsid w:val="009F503D"/>
     <w:rPr>
@@ -5055,10 +5651,10 @@
       <w:szCs w:val="40"/>
     </w:rPr>
   </w:style>
-  <w:style w:type="character" w:customStyle="1" w:styleId="2Char">
-    <w:name w:val="제목 2 Char"/>
-    <w:basedOn w:val="a0"/>
-    <w:link w:val="2"/>
+  <w:style w:type="character" w:customStyle="1" w:styleId="Heading2Char">
+    <w:name w:val="Heading 2 Char"/>
+    <w:basedOn w:val="DefaultParagraphFont"/>
+    <w:link w:val="Heading2"/>
     <w:uiPriority w:val="9"/>
     <w:rsid w:val="009F503D"/>
     <w:rPr>
@@ -5068,10 +5664,10 @@
       <w:szCs w:val="32"/>
     </w:rPr>
   </w:style>
-  <w:style w:type="character" w:customStyle="1" w:styleId="3Char">
-    <w:name w:val="제목 3 Char"/>
-    <w:basedOn w:val="a0"/>
-    <w:link w:val="3"/>
+  <w:style w:type="character" w:customStyle="1" w:styleId="Heading3Char">
+    <w:name w:val="Heading 3 Char"/>
+    <w:basedOn w:val="DefaultParagraphFont"/>
+    <w:link w:val="Heading3"/>
     <w:uiPriority w:val="9"/>
     <w:semiHidden/>
     <w:rsid w:val="009F503D"/>
@@ -5082,10 +5678,10 @@
       <w:szCs w:val="28"/>
     </w:rPr>
   </w:style>
-  <w:style w:type="character" w:customStyle="1" w:styleId="4Char">
-    <w:name w:val="제목 4 Char"/>
-    <w:basedOn w:val="a0"/>
-    <w:link w:val="4"/>
+  <w:style w:type="character" w:customStyle="1" w:styleId="Heading4Char">
+    <w:name w:val="Heading 4 Char"/>
+    <w:basedOn w:val="DefaultParagraphFont"/>
+    <w:link w:val="Heading4"/>
     <w:uiPriority w:val="9"/>
     <w:semiHidden/>
     <w:rsid w:val="009F503D"/>
@@ -5096,10 +5692,10 @@
       <w:color w:val="0F4761" w:themeColor="accent1" w:themeShade="BF"/>
     </w:rPr>
   </w:style>
-  <w:style w:type="character" w:customStyle="1" w:styleId="5Char">
-    <w:name w:val="제목 5 Char"/>
-    <w:basedOn w:val="a0"/>
-    <w:link w:val="5"/>
+  <w:style w:type="character" w:customStyle="1" w:styleId="Heading5Char">
+    <w:name w:val="Heading 5 Char"/>
+    <w:basedOn w:val="DefaultParagraphFont"/>
+    <w:link w:val="Heading5"/>
     <w:uiPriority w:val="9"/>
     <w:semiHidden/>
     <w:rsid w:val="009F503D"/>
@@ -5108,10 +5704,10 @@
       <w:color w:val="0F4761" w:themeColor="accent1" w:themeShade="BF"/>
     </w:rPr>
   </w:style>
-  <w:style w:type="character" w:customStyle="1" w:styleId="6Char">
-    <w:name w:val="제목 6 Char"/>
-    <w:basedOn w:val="a0"/>
-    <w:link w:val="6"/>
+  <w:style w:type="character" w:customStyle="1" w:styleId="Heading6Char">
+    <w:name w:val="Heading 6 Char"/>
+    <w:basedOn w:val="DefaultParagraphFont"/>
+    <w:link w:val="Heading6"/>
     <w:uiPriority w:val="9"/>
     <w:semiHidden/>
     <w:rsid w:val="009F503D"/>
@@ -5122,10 +5718,10 @@
       <w:color w:val="595959" w:themeColor="text1" w:themeTint="A6"/>
     </w:rPr>
   </w:style>
-  <w:style w:type="character" w:customStyle="1" w:styleId="7Char">
-    <w:name w:val="제목 7 Char"/>
-    <w:basedOn w:val="a0"/>
-    <w:link w:val="7"/>
+  <w:style w:type="character" w:customStyle="1" w:styleId="Heading7Char">
+    <w:name w:val="Heading 7 Char"/>
+    <w:basedOn w:val="DefaultParagraphFont"/>
+    <w:link w:val="Heading7"/>
     <w:uiPriority w:val="9"/>
     <w:semiHidden/>
     <w:rsid w:val="009F503D"/>
@@ -5134,10 +5730,10 @@
       <w:color w:val="595959" w:themeColor="text1" w:themeTint="A6"/>
     </w:rPr>
   </w:style>
-  <w:style w:type="character" w:customStyle="1" w:styleId="8Char">
-    <w:name w:val="제목 8 Char"/>
-    <w:basedOn w:val="a0"/>
-    <w:link w:val="8"/>
+  <w:style w:type="character" w:customStyle="1" w:styleId="Heading8Char">
+    <w:name w:val="Heading 8 Char"/>
+    <w:basedOn w:val="DefaultParagraphFont"/>
+    <w:link w:val="Heading8"/>
     <w:uiPriority w:val="9"/>
     <w:semiHidden/>
     <w:rsid w:val="009F503D"/>
@@ -5148,10 +5744,10 @@
       <w:color w:val="272727" w:themeColor="text1" w:themeTint="D8"/>
     </w:rPr>
   </w:style>
-  <w:style w:type="character" w:customStyle="1" w:styleId="9Char">
-    <w:name w:val="제목 9 Char"/>
-    <w:basedOn w:val="a0"/>
-    <w:link w:val="9"/>
+  <w:style w:type="character" w:customStyle="1" w:styleId="Heading9Char">
+    <w:name w:val="Heading 9 Char"/>
+    <w:basedOn w:val="DefaultParagraphFont"/>
+    <w:link w:val="Heading9"/>
     <w:uiPriority w:val="9"/>
     <w:semiHidden/>
     <w:rsid w:val="009F503D"/>
@@ -5160,11 +5756,11 @@
       <w:color w:val="272727" w:themeColor="text1" w:themeTint="D8"/>
     </w:rPr>
   </w:style>
-  <w:style w:type="paragraph" w:styleId="a3">
+  <w:style w:type="paragraph" w:styleId="Title">
     <w:name w:val="Title"/>
-    <w:basedOn w:val="a"/>
-    <w:next w:val="a"/>
-    <w:link w:val="Char"/>
+    <w:basedOn w:val="Normal"/>
+    <w:next w:val="Normal"/>
+    <w:link w:val="TitleChar"/>
     <w:uiPriority w:val="10"/>
     <w:qFormat/>
     <w:rsid w:val="009F503D"/>
@@ -5180,10 +5776,10 @@
       <w:szCs w:val="56"/>
     </w:rPr>
   </w:style>
-  <w:style w:type="character" w:customStyle="1" w:styleId="Char">
-    <w:name w:val="제목 Char"/>
-    <w:basedOn w:val="a0"/>
-    <w:link w:val="a3"/>
+  <w:style w:type="character" w:customStyle="1" w:styleId="TitleChar">
+    <w:name w:val="Title Char"/>
+    <w:basedOn w:val="DefaultParagraphFont"/>
+    <w:link w:val="Title"/>
     <w:uiPriority w:val="10"/>
     <w:rsid w:val="009F503D"/>
     <w:rPr>
@@ -5194,11 +5790,11 @@
       <w:szCs w:val="56"/>
     </w:rPr>
   </w:style>
-  <w:style w:type="paragraph" w:styleId="a4">
+  <w:style w:type="paragraph" w:styleId="Subtitle">
     <w:name w:val="Subtitle"/>
-    <w:basedOn w:val="a"/>
-    <w:next w:val="a"/>
-    <w:link w:val="Char0"/>
+    <w:basedOn w:val="Normal"/>
+    <w:next w:val="Normal"/>
+    <w:link w:val="SubtitleChar"/>
     <w:uiPriority w:val="11"/>
     <w:qFormat/>
     <w:rsid w:val="009F503D"/>
@@ -5215,10 +5811,10 @@
       <w:szCs w:val="28"/>
     </w:rPr>
   </w:style>
-  <w:style w:type="character" w:customStyle="1" w:styleId="Char0">
-    <w:name w:val="부제 Char"/>
-    <w:basedOn w:val="a0"/>
-    <w:link w:val="a4"/>
+  <w:style w:type="character" w:customStyle="1" w:styleId="SubtitleChar">
+    <w:name w:val="Subtitle Char"/>
+    <w:basedOn w:val="DefaultParagraphFont"/>
+    <w:link w:val="Subtitle"/>
     <w:uiPriority w:val="11"/>
     <w:rsid w:val="009F503D"/>
     <w:rPr>
@@ -5229,11 +5825,11 @@
       <w:szCs w:val="28"/>
     </w:rPr>
   </w:style>
-  <w:style w:type="paragraph" w:styleId="a5">
+  <w:style w:type="paragraph" w:styleId="Quote">
     <w:name w:val="Quote"/>
-    <w:basedOn w:val="a"/>
-    <w:next w:val="a"/>
-    <w:link w:val="Char1"/>
+    <w:basedOn w:val="Normal"/>
+    <w:next w:val="Normal"/>
+    <w:link w:val="QuoteChar"/>
     <w:uiPriority w:val="29"/>
     <w:qFormat/>
     <w:rsid w:val="009F503D"/>
@@ -5247,10 +5843,10 @@
       <w:color w:val="404040" w:themeColor="text1" w:themeTint="BF"/>
     </w:rPr>
   </w:style>
-  <w:style w:type="character" w:customStyle="1" w:styleId="Char1">
-    <w:name w:val="인용 Char"/>
-    <w:basedOn w:val="a0"/>
-    <w:link w:val="a5"/>
+  <w:style w:type="character" w:customStyle="1" w:styleId="QuoteChar">
+    <w:name w:val="Quote Char"/>
+    <w:basedOn w:val="DefaultParagraphFont"/>
+    <w:link w:val="Quote"/>
     <w:uiPriority w:val="29"/>
     <w:rsid w:val="009F503D"/>
     <w:rPr>
@@ -5259,9 +5855,9 @@
       <w:color w:val="404040" w:themeColor="text1" w:themeTint="BF"/>
     </w:rPr>
   </w:style>
-  <w:style w:type="paragraph" w:styleId="a6">
+  <w:style w:type="paragraph" w:styleId="ListParagraph">
     <w:name w:val="List Paragraph"/>
-    <w:basedOn w:val="a"/>
+    <w:basedOn w:val="Normal"/>
     <w:uiPriority w:val="34"/>
     <w:qFormat/>
     <w:rsid w:val="009F503D"/>
@@ -5270,9 +5866,9 @@
       <w:contextualSpacing/>
     </w:pPr>
   </w:style>
-  <w:style w:type="character" w:styleId="a7">
+  <w:style w:type="character" w:styleId="IntenseEmphasis">
     <w:name w:val="Intense Emphasis"/>
-    <w:basedOn w:val="a0"/>
+    <w:basedOn w:val="DefaultParagraphFont"/>
     <w:uiPriority w:val="21"/>
     <w:qFormat/>
     <w:rsid w:val="009F503D"/>
@@ -5282,11 +5878,11 @@
       <w:color w:val="0F4761" w:themeColor="accent1" w:themeShade="BF"/>
     </w:rPr>
   </w:style>
-  <w:style w:type="paragraph" w:styleId="a8">
+  <w:style w:type="paragraph" w:styleId="IntenseQuote">
     <w:name w:val="Intense Quote"/>
-    <w:basedOn w:val="a"/>
-    <w:next w:val="a"/>
-    <w:link w:val="Char2"/>
+    <w:basedOn w:val="Normal"/>
+    <w:next w:val="Normal"/>
+    <w:link w:val="IntenseQuoteChar"/>
     <w:uiPriority w:val="30"/>
     <w:qFormat/>
     <w:rsid w:val="009F503D"/>
@@ -5305,10 +5901,10 @@
       <w:color w:val="0F4761" w:themeColor="accent1" w:themeShade="BF"/>
     </w:rPr>
   </w:style>
-  <w:style w:type="character" w:customStyle="1" w:styleId="Char2">
-    <w:name w:val="강한 인용 Char"/>
-    <w:basedOn w:val="a0"/>
-    <w:link w:val="a8"/>
+  <w:style w:type="character" w:customStyle="1" w:styleId="IntenseQuoteChar">
+    <w:name w:val="Intense Quote Char"/>
+    <w:basedOn w:val="DefaultParagraphFont"/>
+    <w:link w:val="IntenseQuote"/>
     <w:uiPriority w:val="30"/>
     <w:rsid w:val="009F503D"/>
     <w:rPr>
@@ -5317,9 +5913,9 @@
       <w:color w:val="0F4761" w:themeColor="accent1" w:themeShade="BF"/>
     </w:rPr>
   </w:style>
-  <w:style w:type="character" w:styleId="a9">
+  <w:style w:type="character" w:styleId="IntenseReference">
     <w:name w:val="Intense Reference"/>
-    <w:basedOn w:val="a0"/>
+    <w:basedOn w:val="DefaultParagraphFont"/>
     <w:uiPriority w:val="32"/>
     <w:qFormat/>
     <w:rsid w:val="009F503D"/>
@@ -5331,9 +5927,9 @@
       <w:spacing w:val="5"/>
     </w:rPr>
   </w:style>
-  <w:style w:type="paragraph" w:styleId="aa">
+  <w:style w:type="paragraph" w:styleId="NoSpacing">
     <w:name w:val="No Spacing"/>
-    <w:link w:val="Char3"/>
+    <w:link w:val="NoSpacingChar"/>
     <w:uiPriority w:val="1"/>
     <w:qFormat/>
     <w:rsid w:val="009F503D"/>
@@ -5347,10 +5943,10 @@
       <w14:ligatures w14:val="none"/>
     </w:rPr>
   </w:style>
-  <w:style w:type="character" w:customStyle="1" w:styleId="Char3">
-    <w:name w:val="간격 없음 Char"/>
-    <w:basedOn w:val="a0"/>
-    <w:link w:val="aa"/>
+  <w:style w:type="character" w:customStyle="1" w:styleId="NoSpacingChar">
+    <w:name w:val="No Spacing Char"/>
+    <w:basedOn w:val="DefaultParagraphFont"/>
+    <w:link w:val="NoSpacing"/>
     <w:uiPriority w:val="1"/>
     <w:rsid w:val="009F503D"/>
     <w:rPr>
@@ -5362,10 +5958,10 @@
       <w14:ligatures w14:val="none"/>
     </w:rPr>
   </w:style>
-  <w:style w:type="paragraph" w:styleId="TOC">
+  <w:style w:type="paragraph" w:styleId="TOCHeading">
     <w:name w:val="TOC Heading"/>
-    <w:basedOn w:val="1"/>
-    <w:next w:val="a"/>
+    <w:basedOn w:val="Heading1"/>
+    <w:next w:val="Normal"/>
     <w:uiPriority w:val="39"/>
     <w:unhideWhenUsed/>
     <w:qFormat/>
@@ -5381,10 +5977,10 @@
       <w14:ligatures w14:val="none"/>
     </w:rPr>
   </w:style>
-  <w:style w:type="paragraph" w:styleId="10">
+  <w:style w:type="paragraph" w:styleId="TOC1">
     <w:name w:val="toc 1"/>
-    <w:basedOn w:val="a"/>
-    <w:next w:val="a"/>
+    <w:basedOn w:val="Normal"/>
+    <w:next w:val="Normal"/>
     <w:autoRedefine/>
     <w:uiPriority w:val="39"/>
     <w:unhideWhenUsed/>
@@ -5393,10 +5989,10 @@
       <w:spacing w:after="100"/>
     </w:pPr>
   </w:style>
-  <w:style w:type="paragraph" w:styleId="20">
+  <w:style w:type="paragraph" w:styleId="TOC2">
     <w:name w:val="toc 2"/>
-    <w:basedOn w:val="a"/>
-    <w:next w:val="a"/>
+    <w:basedOn w:val="Normal"/>
+    <w:next w:val="Normal"/>
     <w:autoRedefine/>
     <w:uiPriority w:val="39"/>
     <w:unhideWhenUsed/>
@@ -5406,9 +6002,9 @@
       <w:ind w:left="240"/>
     </w:pPr>
   </w:style>
-  <w:style w:type="character" w:styleId="ab">
+  <w:style w:type="character" w:styleId="Hyperlink">
     <w:name w:val="Hyperlink"/>
-    <w:basedOn w:val="a0"/>
+    <w:basedOn w:val="DefaultParagraphFont"/>
     <w:uiPriority w:val="99"/>
     <w:unhideWhenUsed/>
     <w:rsid w:val="005F1A24"/>
@@ -5417,10 +6013,10 @@
       <w:u w:val="single"/>
     </w:rPr>
   </w:style>
-  <w:style w:type="paragraph" w:styleId="ac">
+  <w:style w:type="paragraph" w:styleId="Header">
     <w:name w:val="header"/>
-    <w:basedOn w:val="a"/>
-    <w:link w:val="Char4"/>
+    <w:basedOn w:val="Normal"/>
+    <w:link w:val="HeaderChar"/>
     <w:uiPriority w:val="99"/>
     <w:unhideWhenUsed/>
     <w:rsid w:val="00727E6C"/>
@@ -5432,17 +6028,17 @@
       <w:snapToGrid w:val="0"/>
     </w:pPr>
   </w:style>
-  <w:style w:type="character" w:customStyle="1" w:styleId="Char4">
-    <w:name w:val="머리글 Char"/>
-    <w:basedOn w:val="a0"/>
-    <w:link w:val="ac"/>
+  <w:style w:type="character" w:customStyle="1" w:styleId="HeaderChar">
+    <w:name w:val="Header Char"/>
+    <w:basedOn w:val="DefaultParagraphFont"/>
+    <w:link w:val="Header"/>
     <w:uiPriority w:val="99"/>
     <w:rsid w:val="00727E6C"/>
   </w:style>
-  <w:style w:type="paragraph" w:styleId="ad">
+  <w:style w:type="paragraph" w:styleId="Footer">
     <w:name w:val="footer"/>
-    <w:basedOn w:val="a"/>
-    <w:link w:val="Char5"/>
+    <w:basedOn w:val="Normal"/>
+    <w:link w:val="FooterChar"/>
     <w:uiPriority w:val="99"/>
     <w:unhideWhenUsed/>
     <w:rsid w:val="00727E6C"/>
@@ -5454,10 +6050,10 @@
       <w:snapToGrid w:val="0"/>
     </w:pPr>
   </w:style>
-  <w:style w:type="character" w:customStyle="1" w:styleId="Char5">
-    <w:name w:val="바닥글 Char"/>
-    <w:basedOn w:val="a0"/>
-    <w:link w:val="ad"/>
+  <w:style w:type="character" w:customStyle="1" w:styleId="FooterChar">
+    <w:name w:val="Footer Char"/>
+    <w:basedOn w:val="DefaultParagraphFont"/>
+    <w:link w:val="Footer"/>
     <w:uiPriority w:val="99"/>
     <w:rsid w:val="00727E6C"/>
   </w:style>

</xml_diff>